<commit_message>
Rewrite textbook Chapter 1 for logOS 2.0 Blackrock
- Update syscall table (Figure 1.1) from 16 to 28 syscalls
- Rewrite Section 1.1: fork/exec/wait replaces spawn-only model
- Update Section 1.6 (Shell): fork/exec/wait loop, pipes, I/O redirection
- Rewrite Section 1.7 (Real world): remove stale "omissions" now implemented
- Update Section 1.8 (Exercises): replace obsolete spawn/pipe questions

Co-Authored-By: Claude Opus 4.6 (1M context) <noreply@anthropic.com>
</commit_message>
<xml_diff>
--- a/textbook/logos-textbook.docx
+++ b/textbook/logos-textbook.docx
@@ -262,7 +262,7 @@
                 <w:rStyle w:val="Hyperlink"/>
                 <w:noProof/>
               </w:rPr>
-              <w:t>1.1  Processes and spawn</w:t>
+              <w:t>1.1  Processes and process control</w:t>
             </w:r>
             <w:r>
               <w:rPr>
@@ -4247,6 +4247,294 @@
               <w:bottom w:val="single" w:sz="1" w:space="0" w:color="C0C8D0"/>
               <w:right w:val="single" w:sz="1" w:space="0" w:color="C0C8D0"/>
             </w:tcBorders>
+            <w:tcMar>
+              <w:top w:w="60" w:type="dxa"/>
+              <w:left w:w="100" w:type="dxa"/>
+              <w:bottom w:w="60" w:type="dxa"/>
+              <w:right w:w="100" w:type="dxa"/>
+            </w:tcMar>
+            <w:vAlign w:val="center"/>
+          </w:tcPr>
+          <w:p>
+            <w:r>
+              <w:t>fork()</w:t>
+            </w:r>
+          </w:p>
+        </w:tc>
+        <w:tc>
+          <w:tcPr>
+            <w:tcW w:w="4680" w:type="dxa"/>
+            <w:tcBorders>
+              <w:top w:val="single" w:sz="1" w:space="0" w:color="C0C8D0"/>
+              <w:left w:val="single" w:sz="1" w:space="0" w:color="C0C8D0"/>
+              <w:bottom w:val="single" w:sz="1" w:space="0" w:color="C0C8D0"/>
+              <w:right w:val="single" w:sz="1" w:space="0" w:color="C0C8D0"/>
+            </w:tcBorders>
+            <w:tcMar>
+              <w:top w:w="60" w:type="dxa"/>
+              <w:left w:w="100" w:type="dxa"/>
+              <w:bottom w:w="60" w:type="dxa"/>
+              <w:right w:w="100" w:type="dxa"/>
+            </w:tcMar>
+            <w:vAlign w:val="center"/>
+          </w:tcPr>
+          <w:p>
+            <w:r>
+              <w:t>Create a copy of the current process; returns 0 in child</w:t>
+            </w:r>
+          </w:p>
+        </w:tc>
+      </w:tr>
+      <w:tr>
+        <w:tc>
+          <w:tcPr>
+            <w:tcW w:w="4680" w:type="dxa"/>
+            <w:tcBorders>
+              <w:top w:val="single" w:sz="1" w:space="0" w:color="C0C8D0"/>
+              <w:left w:val="single" w:sz="1" w:space="0" w:color="C0C8D0"/>
+              <w:bottom w:val="single" w:sz="1" w:space="0" w:color="C0C8D0"/>
+              <w:right w:val="single" w:sz="1" w:space="0" w:color="C0C8D0"/>
+            </w:tcBorders>
+            <w:tcMar>
+              <w:top w:w="60" w:type="dxa"/>
+              <w:left w:w="100" w:type="dxa"/>
+              <w:bottom w:w="60" w:type="dxa"/>
+              <w:right w:w="100" w:type="dxa"/>
+            </w:tcMar>
+            <w:vAlign w:val="center"/>
+          </w:tcPr>
+          <w:p>
+            <w:r>
+              <w:t>exec(path, argv)</w:t>
+            </w:r>
+          </w:p>
+        </w:tc>
+        <w:tc>
+          <w:tcPr>
+            <w:tcW w:w="4680" w:type="dxa"/>
+            <w:tcBorders>
+              <w:top w:val="single" w:sz="1" w:space="0" w:color="C0C8D0"/>
+              <w:left w:val="single" w:sz="1" w:space="0" w:color="C0C8D0"/>
+              <w:bottom w:val="single" w:sz="1" w:space="0" w:color="C0C8D0"/>
+              <w:right w:val="single" w:sz="1" w:space="0" w:color="C0C8D0"/>
+            </w:tcBorders>
+            <w:tcMar>
+              <w:top w:w="60" w:type="dxa"/>
+              <w:left w:w="100" w:type="dxa"/>
+              <w:bottom w:w="60" w:type="dxa"/>
+              <w:right w:w="100" w:type="dxa"/>
+            </w:tcMar>
+            <w:vAlign w:val="center"/>
+          </w:tcPr>
+          <w:p>
+            <w:r>
+              <w:t>Replace the current process image with a new program</w:t>
+            </w:r>
+          </w:p>
+        </w:tc>
+      </w:tr>
+      <w:tr>
+        <w:tc>
+          <w:tcPr>
+            <w:tcW w:w="4680" w:type="dxa"/>
+            <w:tcBorders>
+              <w:top w:val="single" w:sz="1" w:space="0" w:color="C0C8D0"/>
+              <w:left w:val="single" w:sz="1" w:space="0" w:color="C0C8D0"/>
+              <w:bottom w:val="single" w:sz="1" w:space="0" w:color="C0C8D0"/>
+              <w:right w:val="single" w:sz="1" w:space="0" w:color="C0C8D0"/>
+            </w:tcBorders>
+            <w:tcMar>
+              <w:top w:w="60" w:type="dxa"/>
+              <w:left w:w="100" w:type="dxa"/>
+              <w:bottom w:w="60" w:type="dxa"/>
+              <w:right w:w="100" w:type="dxa"/>
+            </w:tcMar>
+            <w:vAlign w:val="center"/>
+          </w:tcPr>
+          <w:p>
+            <w:r>
+              <w:t>wait()</w:t>
+            </w:r>
+          </w:p>
+        </w:tc>
+        <w:tc>
+          <w:tcPr>
+            <w:tcW w:w="4680" w:type="dxa"/>
+            <w:tcBorders>
+              <w:top w:val="single" w:sz="1" w:space="0" w:color="C0C8D0"/>
+              <w:left w:val="single" w:sz="1" w:space="0" w:color="C0C8D0"/>
+              <w:bottom w:val="single" w:sz="1" w:space="0" w:color="C0C8D0"/>
+              <w:right w:val="single" w:sz="1" w:space="0" w:color="C0C8D0"/>
+            </w:tcBorders>
+            <w:tcMar>
+              <w:top w:w="60" w:type="dxa"/>
+              <w:left w:w="100" w:type="dxa"/>
+              <w:bottom w:w="60" w:type="dxa"/>
+              <w:right w:w="100" w:type="dxa"/>
+            </w:tcMar>
+            <w:vAlign w:val="center"/>
+          </w:tcPr>
+          <w:p>
+            <w:r>
+              <w:t>Wait for a child process to exit; returns its exit code</w:t>
+            </w:r>
+          </w:p>
+        </w:tc>
+      </w:tr>
+      <w:tr>
+        <w:tc>
+          <w:tcPr>
+            <w:tcW w:w="4680" w:type="dxa"/>
+            <w:tcBorders>
+              <w:top w:val="single" w:sz="1" w:space="0" w:color="C0C8D0"/>
+              <w:left w:val="single" w:sz="1" w:space="0" w:color="C0C8D0"/>
+              <w:bottom w:val="single" w:sz="1" w:space="0" w:color="C0C8D0"/>
+              <w:right w:val="single" w:sz="1" w:space="0" w:color="C0C8D0"/>
+            </w:tcBorders>
+            <w:tcMar>
+              <w:top w:w="60" w:type="dxa"/>
+              <w:left w:w="100" w:type="dxa"/>
+              <w:bottom w:w="60" w:type="dxa"/>
+              <w:right w:w="100" w:type="dxa"/>
+            </w:tcMar>
+            <w:vAlign w:val="center"/>
+          </w:tcPr>
+          <w:p>
+            <w:r>
+              <w:t>getpid()</w:t>
+            </w:r>
+          </w:p>
+        </w:tc>
+        <w:tc>
+          <w:tcPr>
+            <w:tcW w:w="4680" w:type="dxa"/>
+            <w:tcBorders>
+              <w:top w:val="single" w:sz="1" w:space="0" w:color="C0C8D0"/>
+              <w:left w:val="single" w:sz="1" w:space="0" w:color="C0C8D0"/>
+              <w:bottom w:val="single" w:sz="1" w:space="0" w:color="C0C8D0"/>
+              <w:right w:val="single" w:sz="1" w:space="0" w:color="C0C8D0"/>
+            </w:tcBorders>
+            <w:tcMar>
+              <w:top w:w="60" w:type="dxa"/>
+              <w:left w:w="100" w:type="dxa"/>
+              <w:bottom w:w="60" w:type="dxa"/>
+              <w:right w:w="100" w:type="dxa"/>
+            </w:tcMar>
+            <w:vAlign w:val="center"/>
+          </w:tcPr>
+          <w:p>
+            <w:r>
+              <w:t>Return the current process’s PID</w:t>
+            </w:r>
+          </w:p>
+        </w:tc>
+      </w:tr>
+      <w:tr>
+        <w:tc>
+          <w:tcPr>
+            <w:tcW w:w="4680" w:type="dxa"/>
+            <w:tcBorders>
+              <w:top w:val="single" w:sz="1" w:space="0" w:color="C0C8D0"/>
+              <w:left w:val="single" w:sz="1" w:space="0" w:color="C0C8D0"/>
+              <w:bottom w:val="single" w:sz="1" w:space="0" w:color="C0C8D0"/>
+              <w:right w:val="single" w:sz="1" w:space="0" w:color="C0C8D0"/>
+            </w:tcBorders>
+            <w:tcMar>
+              <w:top w:w="60" w:type="dxa"/>
+              <w:left w:w="100" w:type="dxa"/>
+              <w:bottom w:w="60" w:type="dxa"/>
+              <w:right w:w="100" w:type="dxa"/>
+            </w:tcMar>
+            <w:vAlign w:val="center"/>
+          </w:tcPr>
+          <w:p>
+            <w:r>
+              <w:t>kill(pid)</w:t>
+            </w:r>
+          </w:p>
+        </w:tc>
+        <w:tc>
+          <w:tcPr>
+            <w:tcW w:w="4680" w:type="dxa"/>
+            <w:tcBorders>
+              <w:top w:val="single" w:sz="1" w:space="0" w:color="C0C8D0"/>
+              <w:left w:val="single" w:sz="1" w:space="0" w:color="C0C8D0"/>
+              <w:bottom w:val="single" w:sz="1" w:space="0" w:color="C0C8D0"/>
+              <w:right w:val="single" w:sz="1" w:space="0" w:color="C0C8D0"/>
+            </w:tcBorders>
+            <w:tcMar>
+              <w:top w:w="60" w:type="dxa"/>
+              <w:left w:w="100" w:type="dxa"/>
+              <w:bottom w:w="60" w:type="dxa"/>
+              <w:right w:w="100" w:type="dxa"/>
+            </w:tcMar>
+            <w:vAlign w:val="center"/>
+          </w:tcPr>
+          <w:p>
+            <w:r>
+              <w:t>Terminate a process by PID</w:t>
+            </w:r>
+          </w:p>
+        </w:tc>
+      </w:tr>
+      <w:tr>
+        <w:tc>
+          <w:tcPr>
+            <w:tcW w:w="4680" w:type="dxa"/>
+            <w:tcBorders>
+              <w:top w:val="single" w:sz="1" w:space="0" w:color="C0C8D0"/>
+              <w:left w:val="single" w:sz="1" w:space="0" w:color="C0C8D0"/>
+              <w:bottom w:val="single" w:sz="1" w:space="0" w:color="C0C8D0"/>
+              <w:right w:val="single" w:sz="1" w:space="0" w:color="C0C8D0"/>
+            </w:tcBorders>
+            <w:tcMar>
+              <w:top w:w="60" w:type="dxa"/>
+              <w:left w:w="100" w:type="dxa"/>
+              <w:bottom w:w="60" w:type="dxa"/>
+              <w:right w:w="100" w:type="dxa"/>
+            </w:tcMar>
+            <w:vAlign w:val="center"/>
+          </w:tcPr>
+          <w:p>
+            <w:r>
+              <w:t>ps(buf, maxprocs)</w:t>
+            </w:r>
+          </w:p>
+        </w:tc>
+        <w:tc>
+          <w:tcPr>
+            <w:tcW w:w="4680" w:type="dxa"/>
+            <w:tcBorders>
+              <w:top w:val="single" w:sz="1" w:space="0" w:color="C0C8D0"/>
+              <w:left w:val="single" w:sz="1" w:space="0" w:color="C0C8D0"/>
+              <w:bottom w:val="single" w:sz="1" w:space="0" w:color="C0C8D0"/>
+              <w:right w:val="single" w:sz="1" w:space="0" w:color="C0C8D0"/>
+            </w:tcBorders>
+            <w:tcMar>
+              <w:top w:w="60" w:type="dxa"/>
+              <w:left w:w="100" w:type="dxa"/>
+              <w:bottom w:w="60" w:type="dxa"/>
+              <w:right w:w="100" w:type="dxa"/>
+            </w:tcMar>
+            <w:vAlign w:val="center"/>
+          </w:tcPr>
+          <w:p>
+            <w:r>
+              <w:t>List active processes into buffer</w:t>
+            </w:r>
+          </w:p>
+        </w:tc>
+      </w:tr>
+      <w:tr>
+        <w:tc>
+          <w:tcPr>
+            <w:tcW w:w="4680" w:type="dxa"/>
+            <w:tcBorders>
+              <w:top w:val="single" w:sz="1" w:space="0" w:color="C0C8D0"/>
+              <w:left w:val="single" w:sz="1" w:space="0" w:color="C0C8D0"/>
+              <w:bottom w:val="single" w:sz="1" w:space="0" w:color="C0C8D0"/>
+              <w:right w:val="single" w:sz="1" w:space="0" w:color="C0C8D0"/>
+            </w:tcBorders>
             <w:shd w:val="clear" w:color="auto" w:fill="F0F0F0"/>
             <w:tcMar>
               <w:top w:w="60" w:type="dxa"/>
@@ -4488,6 +4776,150 @@
               <w:bottom w:val="single" w:sz="1" w:space="0" w:color="C0C8D0"/>
               <w:right w:val="single" w:sz="1" w:space="0" w:color="C0C8D0"/>
             </w:tcBorders>
+            <w:tcMar>
+              <w:top w:w="60" w:type="dxa"/>
+              <w:left w:w="100" w:type="dxa"/>
+              <w:bottom w:w="60" w:type="dxa"/>
+              <w:right w:w="100" w:type="dxa"/>
+            </w:tcMar>
+            <w:vAlign w:val="center"/>
+          </w:tcPr>
+          <w:p>
+            <w:r>
+              <w:t>dup(fd)</w:t>
+            </w:r>
+          </w:p>
+        </w:tc>
+        <w:tc>
+          <w:tcPr>
+            <w:tcW w:w="4680" w:type="dxa"/>
+            <w:tcBorders>
+              <w:top w:val="single" w:sz="1" w:space="0" w:color="C0C8D0"/>
+              <w:left w:val="single" w:sz="1" w:space="0" w:color="C0C8D0"/>
+              <w:bottom w:val="single" w:sz="1" w:space="0" w:color="C0C8D0"/>
+              <w:right w:val="single" w:sz="1" w:space="0" w:color="C0C8D0"/>
+            </w:tcBorders>
+            <w:tcMar>
+              <w:top w:w="60" w:type="dxa"/>
+              <w:left w:w="100" w:type="dxa"/>
+              <w:bottom w:w="60" w:type="dxa"/>
+              <w:right w:w="100" w:type="dxa"/>
+            </w:tcMar>
+            <w:vAlign w:val="center"/>
+          </w:tcPr>
+          <w:p>
+            <w:r>
+              <w:t>Duplicate a file descriptor</w:t>
+            </w:r>
+          </w:p>
+        </w:tc>
+      </w:tr>
+      <w:tr>
+        <w:tc>
+          <w:tcPr>
+            <w:tcW w:w="4680" w:type="dxa"/>
+            <w:tcBorders>
+              <w:top w:val="single" w:sz="1" w:space="0" w:color="C0C8D0"/>
+              <w:left w:val="single" w:sz="1" w:space="0" w:color="C0C8D0"/>
+              <w:bottom w:val="single" w:sz="1" w:space="0" w:color="C0C8D0"/>
+              <w:right w:val="single" w:sz="1" w:space="0" w:color="C0C8D0"/>
+            </w:tcBorders>
+            <w:tcMar>
+              <w:top w:w="60" w:type="dxa"/>
+              <w:left w:w="100" w:type="dxa"/>
+              <w:bottom w:w="60" w:type="dxa"/>
+              <w:right w:w="100" w:type="dxa"/>
+            </w:tcMar>
+            <w:vAlign w:val="center"/>
+          </w:tcPr>
+          <w:p>
+            <w:r>
+              <w:t>dup2(oldfd, newfd)</w:t>
+            </w:r>
+          </w:p>
+        </w:tc>
+        <w:tc>
+          <w:tcPr>
+            <w:tcW w:w="4680" w:type="dxa"/>
+            <w:tcBorders>
+              <w:top w:val="single" w:sz="1" w:space="0" w:color="C0C8D0"/>
+              <w:left w:val="single" w:sz="1" w:space="0" w:color="C0C8D0"/>
+              <w:bottom w:val="single" w:sz="1" w:space="0" w:color="C0C8D0"/>
+              <w:right w:val="single" w:sz="1" w:space="0" w:color="C0C8D0"/>
+            </w:tcBorders>
+            <w:tcMar>
+              <w:top w:w="60" w:type="dxa"/>
+              <w:left w:w="100" w:type="dxa"/>
+              <w:bottom w:w="60" w:type="dxa"/>
+              <w:right w:w="100" w:type="dxa"/>
+            </w:tcMar>
+            <w:vAlign w:val="center"/>
+          </w:tcPr>
+          <w:p>
+            <w:r>
+              <w:t>Duplicate a file descriptor to a specific number</w:t>
+            </w:r>
+          </w:p>
+        </w:tc>
+      </w:tr>
+      <w:tr>
+        <w:tc>
+          <w:tcPr>
+            <w:tcW w:w="4680" w:type="dxa"/>
+            <w:tcBorders>
+              <w:top w:val="single" w:sz="1" w:space="0" w:color="C0C8D0"/>
+              <w:left w:val="single" w:sz="1" w:space="0" w:color="C0C8D0"/>
+              <w:bottom w:val="single" w:sz="1" w:space="0" w:color="C0C8D0"/>
+              <w:right w:val="single" w:sz="1" w:space="0" w:color="C0C8D0"/>
+            </w:tcBorders>
+            <w:tcMar>
+              <w:top w:w="60" w:type="dxa"/>
+              <w:left w:w="100" w:type="dxa"/>
+              <w:bottom w:w="60" w:type="dxa"/>
+              <w:right w:w="100" w:type="dxa"/>
+            </w:tcMar>
+            <w:vAlign w:val="center"/>
+          </w:tcPr>
+          <w:p>
+            <w:r>
+              <w:t>pipe(pipefd)</w:t>
+            </w:r>
+          </w:p>
+        </w:tc>
+        <w:tc>
+          <w:tcPr>
+            <w:tcW w:w="4680" w:type="dxa"/>
+            <w:tcBorders>
+              <w:top w:val="single" w:sz="1" w:space="0" w:color="C0C8D0"/>
+              <w:left w:val="single" w:sz="1" w:space="0" w:color="C0C8D0"/>
+              <w:bottom w:val="single" w:sz="1" w:space="0" w:color="C0C8D0"/>
+              <w:right w:val="single" w:sz="1" w:space="0" w:color="C0C8D0"/>
+            </w:tcBorders>
+            <w:tcMar>
+              <w:top w:w="60" w:type="dxa"/>
+              <w:left w:w="100" w:type="dxa"/>
+              <w:bottom w:w="60" w:type="dxa"/>
+              <w:right w:w="100" w:type="dxa"/>
+            </w:tcMar>
+            <w:vAlign w:val="center"/>
+          </w:tcPr>
+          <w:p>
+            <w:r>
+              <w:t>Create a pipe; returns read and write file descriptors</w:t>
+            </w:r>
+          </w:p>
+        </w:tc>
+      </w:tr>
+      <w:tr>
+        <w:tc>
+          <w:tcPr>
+            <w:tcW w:w="4680" w:type="dxa"/>
+            <w:tcBorders>
+              <w:top w:val="single" w:sz="1" w:space="0" w:color="C0C8D0"/>
+              <w:left w:val="single" w:sz="1" w:space="0" w:color="C0C8D0"/>
+              <w:bottom w:val="single" w:sz="1" w:space="0" w:color="C0C8D0"/>
+              <w:right w:val="single" w:sz="1" w:space="0" w:color="C0C8D0"/>
+            </w:tcBorders>
             <w:shd w:val="clear" w:color="auto" w:fill="F0F0F0"/>
             <w:tcMar>
               <w:top w:w="60" w:type="dxa"/>
@@ -4777,6 +5209,198 @@
               <w:bottom w:val="single" w:sz="1" w:space="0" w:color="C0C8D0"/>
               <w:right w:val="single" w:sz="1" w:space="0" w:color="C0C8D0"/>
             </w:tcBorders>
+            <w:tcMar>
+              <w:top w:w="60" w:type="dxa"/>
+              <w:left w:w="100" w:type="dxa"/>
+              <w:bottom w:w="60" w:type="dxa"/>
+              <w:right w:w="100" w:type="dxa"/>
+            </w:tcMar>
+            <w:vAlign w:val="center"/>
+          </w:tcPr>
+          <w:p>
+            <w:r>
+              <w:t>unlink(path)</w:t>
+            </w:r>
+          </w:p>
+        </w:tc>
+        <w:tc>
+          <w:tcPr>
+            <w:tcW w:w="4680" w:type="dxa"/>
+            <w:tcBorders>
+              <w:top w:val="single" w:sz="1" w:space="0" w:color="C0C8D0"/>
+              <w:left w:val="single" w:sz="1" w:space="0" w:color="C0C8D0"/>
+              <w:bottom w:val="single" w:sz="1" w:space="0" w:color="C0C8D0"/>
+              <w:right w:val="single" w:sz="1" w:space="0" w:color="C0C8D0"/>
+            </w:tcBorders>
+            <w:tcMar>
+              <w:top w:w="60" w:type="dxa"/>
+              <w:left w:w="100" w:type="dxa"/>
+              <w:bottom w:w="60" w:type="dxa"/>
+              <w:right w:w="100" w:type="dxa"/>
+            </w:tcMar>
+            <w:vAlign w:val="center"/>
+          </w:tcPr>
+          <w:p>
+            <w:r>
+              <w:t>Delete a file</w:t>
+            </w:r>
+          </w:p>
+        </w:tc>
+      </w:tr>
+      <w:tr>
+        <w:tc>
+          <w:tcPr>
+            <w:tcW w:w="4680" w:type="dxa"/>
+            <w:tcBorders>
+              <w:top w:val="single" w:sz="1" w:space="0" w:color="C0C8D0"/>
+              <w:left w:val="single" w:sz="1" w:space="0" w:color="C0C8D0"/>
+              <w:bottom w:val="single" w:sz="1" w:space="0" w:color="C0C8D0"/>
+              <w:right w:val="single" w:sz="1" w:space="0" w:color="C0C8D0"/>
+            </w:tcBorders>
+            <w:tcMar>
+              <w:top w:w="60" w:type="dxa"/>
+              <w:left w:w="100" w:type="dxa"/>
+              <w:bottom w:w="60" w:type="dxa"/>
+              <w:right w:w="100" w:type="dxa"/>
+            </w:tcMar>
+            <w:vAlign w:val="center"/>
+          </w:tcPr>
+          <w:p>
+            <w:r>
+              <w:t>link(target, linkpath)</w:t>
+            </w:r>
+          </w:p>
+        </w:tc>
+        <w:tc>
+          <w:tcPr>
+            <w:tcW w:w="4680" w:type="dxa"/>
+            <w:tcBorders>
+              <w:top w:val="single" w:sz="1" w:space="0" w:color="C0C8D0"/>
+              <w:left w:val="single" w:sz="1" w:space="0" w:color="C0C8D0"/>
+              <w:bottom w:val="single" w:sz="1" w:space="0" w:color="C0C8D0"/>
+              <w:right w:val="single" w:sz="1" w:space="0" w:color="C0C8D0"/>
+            </w:tcBorders>
+            <w:tcMar>
+              <w:top w:w="60" w:type="dxa"/>
+              <w:left w:w="100" w:type="dxa"/>
+              <w:bottom w:w="60" w:type="dxa"/>
+              <w:right w:w="100" w:type="dxa"/>
+            </w:tcMar>
+            <w:vAlign w:val="center"/>
+          </w:tcPr>
+          <w:p>
+            <w:r>
+              <w:t>Create a hard link to an existing file</w:t>
+            </w:r>
+          </w:p>
+        </w:tc>
+      </w:tr>
+      <w:tr>
+        <w:tc>
+          <w:tcPr>
+            <w:tcW w:w="4680" w:type="dxa"/>
+            <w:tcBorders>
+              <w:top w:val="single" w:sz="1" w:space="0" w:color="C0C8D0"/>
+              <w:left w:val="single" w:sz="1" w:space="0" w:color="C0C8D0"/>
+              <w:bottom w:val="single" w:sz="1" w:space="0" w:color="C0C8D0"/>
+              <w:right w:val="single" w:sz="1" w:space="0" w:color="C0C8D0"/>
+            </w:tcBorders>
+            <w:tcMar>
+              <w:top w:w="60" w:type="dxa"/>
+              <w:left w:w="100" w:type="dxa"/>
+              <w:bottom w:w="60" w:type="dxa"/>
+              <w:right w:w="100" w:type="dxa"/>
+            </w:tcMar>
+            <w:vAlign w:val="center"/>
+          </w:tcPr>
+          <w:p>
+            <w:r>
+              <w:t>rename(oldpath, newpath)</w:t>
+            </w:r>
+          </w:p>
+        </w:tc>
+        <w:tc>
+          <w:tcPr>
+            <w:tcW w:w="4680" w:type="dxa"/>
+            <w:tcBorders>
+              <w:top w:val="single" w:sz="1" w:space="0" w:color="C0C8D0"/>
+              <w:left w:val="single" w:sz="1" w:space="0" w:color="C0C8D0"/>
+              <w:bottom w:val="single" w:sz="1" w:space="0" w:color="C0C8D0"/>
+              <w:right w:val="single" w:sz="1" w:space="0" w:color="C0C8D0"/>
+            </w:tcBorders>
+            <w:tcMar>
+              <w:top w:w="60" w:type="dxa"/>
+              <w:left w:w="100" w:type="dxa"/>
+              <w:bottom w:w="60" w:type="dxa"/>
+              <w:right w:w="100" w:type="dxa"/>
+            </w:tcMar>
+            <w:vAlign w:val="center"/>
+          </w:tcPr>
+          <w:p>
+            <w:r>
+              <w:t>Move or rename a file or directory</w:t>
+            </w:r>
+          </w:p>
+        </w:tc>
+      </w:tr>
+      <w:tr>
+        <w:tc>
+          <w:tcPr>
+            <w:tcW w:w="4680" w:type="dxa"/>
+            <w:tcBorders>
+              <w:top w:val="single" w:sz="1" w:space="0" w:color="C0C8D0"/>
+              <w:left w:val="single" w:sz="1" w:space="0" w:color="C0C8D0"/>
+              <w:bottom w:val="single" w:sz="1" w:space="0" w:color="C0C8D0"/>
+              <w:right w:val="single" w:sz="1" w:space="0" w:color="C0C8D0"/>
+            </w:tcBorders>
+            <w:tcMar>
+              <w:top w:w="60" w:type="dxa"/>
+              <w:left w:w="100" w:type="dxa"/>
+              <w:bottom w:w="60" w:type="dxa"/>
+              <w:right w:w="100" w:type="dxa"/>
+            </w:tcMar>
+            <w:vAlign w:val="center"/>
+          </w:tcPr>
+          <w:p>
+            <w:r>
+              <w:t>stat(path, statbuf)</w:t>
+            </w:r>
+          </w:p>
+        </w:tc>
+        <w:tc>
+          <w:tcPr>
+            <w:tcW w:w="4680" w:type="dxa"/>
+            <w:tcBorders>
+              <w:top w:val="single" w:sz="1" w:space="0" w:color="C0C8D0"/>
+              <w:left w:val="single" w:sz="1" w:space="0" w:color="C0C8D0"/>
+              <w:bottom w:val="single" w:sz="1" w:space="0" w:color="C0C8D0"/>
+              <w:right w:val="single" w:sz="1" w:space="0" w:color="C0C8D0"/>
+            </w:tcBorders>
+            <w:tcMar>
+              <w:top w:w="60" w:type="dxa"/>
+              <w:left w:w="100" w:type="dxa"/>
+              <w:bottom w:w="60" w:type="dxa"/>
+              <w:right w:w="100" w:type="dxa"/>
+            </w:tcMar>
+            <w:vAlign w:val="center"/>
+          </w:tcPr>
+          <w:p>
+            <w:r>
+              <w:t>Get file metadata (size, type, link count)</w:t>
+            </w:r>
+          </w:p>
+        </w:tc>
+      </w:tr>
+      <w:tr>
+        <w:tc>
+          <w:tcPr>
+            <w:tcW w:w="4680" w:type="dxa"/>
+            <w:tcBorders>
+              <w:top w:val="single" w:sz="1" w:space="0" w:color="C0C8D0"/>
+              <w:left w:val="single" w:sz="1" w:space="0" w:color="C0C8D0"/>
+              <w:bottom w:val="single" w:sz="1" w:space="0" w:color="C0C8D0"/>
+              <w:right w:val="single" w:sz="1" w:space="0" w:color="C0C8D0"/>
+            </w:tcBorders>
             <w:shd w:val="clear" w:color="auto" w:fill="F0F0F0"/>
             <w:tcMar>
               <w:top w:w="60" w:type="dxa"/>
@@ -5020,7 +5644,7 @@
         <w:t xml:space="preserve">1.1  </w:t>
       </w:r>
       <w:r>
-        <w:t>Processes and spawn</w:t>
+        <w:t>Processes and process control</w:t>
       </w:r>
       <w:bookmarkEnd w:id="3"/>
     </w:p>
@@ -5058,17 +5682,17 @@
         <w:t>OS</w:t>
       </w:r>
       <w:r>
-        <w:t xml:space="preserve"> provides the spawn() system call to create a new process. It loads an executable from the filesystem into a fresh memory slot, sets up its stack, and begins executing it. The calling process is </w:t>
+        <w:t xml:space="preserve"> uses the standard Unix fork/exec/wait pattern for process creation. fork() creates a copy of the calling process. The new process (the </w:t>
       </w:r>
       <w:r>
         <w:rPr>
           <w:i/>
           <w:iCs/>
         </w:rPr>
-        <w:t>suspended</w:t>
-      </w:r>
-      <w:r>
-        <w:t xml:space="preserve"> until the child terminates; when the child calls exit(), the parent resumes and spawn() returns the child's exit code.</w:t>
+        <w:t>child</w:t>
+      </w:r>
+      <w:r>
+        <w:t xml:space="preserve">) is an exact duplicate of the parent: it has the same memory contents, file descriptors, and environment variables. fork() returns the child’s PID to the parent and 0 to the child, so the two can distinguish themselves. exec() replaces the current process’s memory with a new program loaded from the filesystem. wait() blocks the calling process until one of its children exits and returns the child’s exit code.</w:t>
       </w:r>
     </w:p>
     <w:p>
@@ -5076,7 +5700,7 @@
         <w:spacing w:before="80" w:after="80"/>
       </w:pPr>
       <w:r>
-        <w:t>This is different from Unix's fork()/exec() pair. In Unix, fork() creates a copy of the calling process, and exec() replaces the copy's memory with a new program. log</w:t>
+        <w:t>The shell uses this pattern to run commands: it calls fork() to create a child, the child calls exec() to load and run the command, and the parent calls wait() to block until the child finishes. Separating fork from exec allows the child to set up I/O redirection (e.g., redirecting stdout to a file or a pipe) between the two calls, before the new program starts. This is how the shell implements pipelines and I/O redirection. log</w:t>
       </w:r>
       <w:r>
         <w:rPr>
@@ -5086,27 +5710,7 @@
         <w:t>OS</w:t>
       </w:r>
       <w:r>
-        <w:t xml:space="preserve"> 1.0 combines these into a single spawn() call, which is simpler and avoids copying the parent process'es entire memory content. The trade-off is that log</w:t>
-      </w:r>
-      <w:r>
-        <w:rPr>
-          <w:i/>
-          <w:iCs/>
-        </w:rPr>
-        <w:t>OS</w:t>
-      </w:r>
-      <w:r>
-        <w:t xml:space="preserve"> cannot support the Unix pattern of having the child modify its file descriptors between fork() and exec(), which is how Unix implements I/O redirection and pipelines. This will be addressed in the next version of log</w:t>
-      </w:r>
-      <w:r>
-        <w:rPr>
-          <w:i/>
-          <w:iCs/>
-        </w:rPr>
-        <w:t>OS</w:t>
-      </w:r>
-      <w:r>
-        <w:t>.</w:t>
+        <w:t xml:space="preserve"> also retains the simpler spawn() call as a convenience that combines fork, exec, and wait in a single step. spawn() is useful when a program simply needs to run another program and wait for it to finish, without any I/O redirection.</w:t>
       </w:r>
     </w:p>
     <w:p>
@@ -5426,7 +6030,7 @@
         <w:spacing w:before="80" w:after="80"/>
       </w:pPr>
       <w:r>
-        <w:t>A program that wants to run another program uses spawn(). For example (user/spawn_demo.c):</w:t>
+        <w:t>A program that wants to run another program typically uses fork() and exec(). The following example (user/fork_demo.c) forks a child, the child calls exec() to run /bin/hello, and the parent waits for it:</w:t>
       </w:r>
     </w:p>
     <w:p>
@@ -5494,140 +6098,36 @@
                 <w:sz w:val="18"/>
                 <w:szCs w:val="18"/>
               </w:rPr>
-              <w:t>int main(int argc, char *argv[])</w:t>
+              <w:t>int main(void)</w:t>
               <w:br/>
               <w:t>{</w:t>
               <w:br/>
-              <w:t xml:space="preserve">   char *child_argv[4]; /* Build argv array at runtime */</w:t>
-            </w:r>
-          </w:p>
-          <w:p>
-            <w:pPr>
-              <w:spacing w:line="300" w:lineRule="auto"/>
-              <w:rPr>
-                <w:rFonts w:ascii="Courier New" w:eastAsia="Courier New" w:hAnsi="Courier New" w:cs="Courier New"/>
-                <w:color w:val="24292E"/>
-                <w:sz w:val="18"/>
-                <w:szCs w:val="18"/>
-              </w:rPr>
-            </w:pPr>
-            <w:r>
-              <w:rPr>
-                <w:rFonts w:ascii="Courier New" w:eastAsia="Courier New" w:hAnsi="Courier New" w:cs="Courier New"/>
-                <w:color w:val="24292E"/>
-                <w:sz w:val="18"/>
-                <w:szCs w:val="18"/>
-              </w:rPr>
-              <w:t xml:space="preserve">   child_argv[0] = "hello";</w:t>
-            </w:r>
-          </w:p>
-          <w:p>
-            <w:pPr>
-              <w:spacing w:line="300" w:lineRule="auto"/>
-              <w:rPr>
-                <w:rFonts w:ascii="Courier New" w:eastAsia="Courier New" w:hAnsi="Courier New" w:cs="Courier New"/>
-                <w:color w:val="24292E"/>
-                <w:sz w:val="18"/>
-                <w:szCs w:val="18"/>
-              </w:rPr>
-            </w:pPr>
-            <w:r>
-              <w:rPr>
-                <w:rFonts w:ascii="Courier New" w:eastAsia="Courier New" w:hAnsi="Courier New" w:cs="Courier New"/>
-                <w:color w:val="24292E"/>
-                <w:sz w:val="18"/>
-                <w:szCs w:val="18"/>
-              </w:rPr>
-              <w:t xml:space="preserve">   child_argv[1] = "arg1";</w:t>
-            </w:r>
-          </w:p>
-          <w:p>
-            <w:pPr>
-              <w:spacing w:line="300" w:lineRule="auto"/>
-              <w:rPr>
-                <w:rFonts w:ascii="Courier New" w:eastAsia="Courier New" w:hAnsi="Courier New" w:cs="Courier New"/>
-                <w:color w:val="24292E"/>
-                <w:sz w:val="18"/>
-                <w:szCs w:val="18"/>
-              </w:rPr>
-            </w:pPr>
-            <w:r>
-              <w:rPr>
-                <w:rFonts w:ascii="Courier New" w:eastAsia="Courier New" w:hAnsi="Courier New" w:cs="Courier New"/>
-                <w:color w:val="24292E"/>
-                <w:sz w:val="18"/>
-                <w:szCs w:val="18"/>
-              </w:rPr>
-              <w:t xml:space="preserve">   child_argv[2] = "arg2";</w:t>
-            </w:r>
-          </w:p>
-          <w:p>
-            <w:pPr>
-              <w:spacing w:line="300" w:lineRule="auto"/>
-              <w:rPr>
-                <w:rFonts w:ascii="Courier New" w:eastAsia="Courier New" w:hAnsi="Courier New" w:cs="Courier New"/>
-                <w:color w:val="24292E"/>
-                <w:sz w:val="18"/>
-                <w:szCs w:val="18"/>
-              </w:rPr>
-            </w:pPr>
-            <w:r>
-              <w:rPr>
-                <w:rFonts w:ascii="Courier New" w:eastAsia="Courier New" w:hAnsi="Courier New" w:cs="Courier New"/>
-                <w:color w:val="24292E"/>
-                <w:sz w:val="18"/>
-                <w:szCs w:val="18"/>
-              </w:rPr>
-              <w:t xml:space="preserve">   child_argv[3] = (char *)0;</w:t>
-            </w:r>
-          </w:p>
-          <w:p>
-            <w:pPr>
-              <w:spacing w:line="300" w:lineRule="auto"/>
-            </w:pPr>
-            <w:r>
-              <w:rPr>
-                <w:rFonts w:ascii="Courier New" w:eastAsia="Courier New" w:hAnsi="Courier New" w:cs="Courier New"/>
-                <w:color w:val="24292E"/>
-                <w:sz w:val="18"/>
-                <w:szCs w:val="18"/>
-              </w:rPr>
-              <w:t xml:space="preserve">   int result = spawn("/bin/hello", child_argv);</w:t>
-            </w:r>
-            <w:r>
+              <w:t xml:space="preserve">   int pid = fork();</w:t>
               <w:br/>
-            </w:r>
-            <w:r>
-              <w:rPr>
-                <w:rFonts w:ascii="Courier New" w:eastAsia="Courier New" w:hAnsi="Courier New" w:cs="Courier New"/>
-                <w:color w:val="24292E"/>
-                <w:sz w:val="18"/>
-                <w:szCs w:val="18"/>
-              </w:rPr>
-              <w:t xml:space="preserve">   printf("spawn returned %d\n", result);</w:t>
-            </w:r>
-            <w:r>
+              <w:t xml:space="preserve">   if (pid == 0) {</w:t>
               <w:br/>
-            </w:r>
-            <w:r>
-              <w:rPr>
-                <w:rFonts w:ascii="Courier New" w:eastAsia="Courier New" w:hAnsi="Courier New" w:cs="Courier New"/>
-                <w:color w:val="24292E"/>
-                <w:sz w:val="18"/>
-                <w:szCs w:val="18"/>
-              </w:rPr>
+              <w:t xml:space="preserve">      /* Child process */</w:t>
+              <w:br/>
+              <w:t xml:space="preserve">      char *argv[2];</w:t>
+              <w:br/>
+              <w:t xml:space="preserve">      argv[0] = "hello";</w:t>
+              <w:br/>
+              <w:t xml:space="preserve">      argv[1] = (char *)0;</w:t>
+              <w:br/>
+              <w:t xml:space="preserve">      exec("/bin/hello", argv);</w:t>
+              <w:br/>
+              <w:t xml:space="preserve">      exit(127); /* exec failed */</w:t>
+              <w:br/>
+              <w:t xml:space="preserve">   }</w:t>
+              <w:br/>
+              <w:t xml:space="preserve">   /* Parent process */</w:t>
+              <w:br/>
+              <w:t xml:space="preserve">   int code = wait();</w:t>
+              <w:br/>
+              <w:t xml:space="preserve">   printf("child exited with %d\n", code);</w:t>
+              <w:br/>
               <w:t xml:space="preserve">   return 0;</w:t>
-            </w:r>
-            <w:r>
               <w:br/>
-            </w:r>
-            <w:r>
-              <w:rPr>
-                <w:rFonts w:ascii="Courier New" w:eastAsia="Courier New" w:hAnsi="Courier New" w:cs="Courier New"/>
-                <w:color w:val="24292E"/>
-                <w:sz w:val="18"/>
-                <w:szCs w:val="18"/>
-              </w:rPr>
               <w:t>}</w:t>
             </w:r>
           </w:p>
@@ -6833,7 +7333,7 @@
         <w:spacing w:before="80" w:after="80"/>
       </w:pPr>
       <w:r>
-        <w:t>The shell reads a line, expands $VAR references, parses the line into words, and either executes a built-in command or spawns an external program. The shell's main loop (simplified) is:</w:t>
+        <w:t>The shell reads a line, expands $VAR references, parses the line into words, and either executes a built-in command or runs an external program using fork/exec/wait. It also handles I/O redirection (&gt;, &gt;&gt;, &lt;) and multi-stage pipelines (cmd1 | cmd2 | cmd3). The shell’s main loop (simplified) is:</w:t>
       </w:r>
     </w:p>
     <w:p>
@@ -7138,7 +7638,7 @@
                 <w:sz w:val="18"/>
                 <w:szCs w:val="18"/>
               </w:rPr>
-              <w:t xml:space="preserve">      run_external(argc, argv); / Search PATH and spawn /</w:t>
+              <w:t xml:space="preserve">      run_external(argc, argv); /* fork, exec, wait */</w:t>
             </w:r>
           </w:p>
           <w:p>
@@ -7177,7 +7677,7 @@
         <w:spacing w:before="80" w:after="80"/>
       </w:pPr>
       <w:r>
-        <w:t>The run_external function searches the directories listed in $PATH for the command name, constructs the full path, and calls spawn(). Given below are some examples of shell commands:</w:t>
+        <w:t>The run_external function searches the directories listed in $PATH for the command name, constructs the full path, then forks a child process. The child calls exec() to run the command, and the parent calls wait() to collect the exit code. If the command line contains pipes (|), the shell creates kernel pipes and forks multiple children, connecting each stage’s stdout to the next stage’s stdin via dup2(). Given below are some examples of shell commands:</w:t>
       </w:r>
     </w:p>
     <w:p>
@@ -7367,6 +7867,78 @@
               <w:t>$ cd /tmp            # Change working directory</w:t>
             </w:r>
           </w:p>
+          <w:p>
+            <w:pPr>
+              <w:spacing w:line="300" w:lineRule="auto"/>
+              <w:rPr>
+                <w:rFonts w:ascii="Courier New" w:hAnsi="Courier New" w:cs="Courier New"/>
+                <w:sz w:val="18"/>
+                <w:szCs w:val="18"/>
+              </w:rPr>
+            </w:pPr>
+            <w:r>
+              <w:rPr>
+                <w:rFonts w:ascii="Courier New" w:hAnsi="Courier New" w:cs="Courier New"/>
+                <w:sz w:val="18"/>
+                <w:szCs w:val="18"/>
+              </w:rPr>
+              <w:t>$ echo hello | cat   # Pipeline: stdout of echo piped to stdin of cat</w:t>
+            </w:r>
+          </w:p>
+          <w:p>
+            <w:pPr>
+              <w:spacing w:line="300" w:lineRule="auto"/>
+              <w:rPr>
+                <w:rFonts w:ascii="Courier New" w:hAnsi="Courier New" w:cs="Courier New"/>
+                <w:sz w:val="18"/>
+                <w:szCs w:val="18"/>
+              </w:rPr>
+            </w:pPr>
+            <w:r>
+              <w:rPr>
+                <w:rFonts w:ascii="Courier New" w:hAnsi="Courier New" w:cs="Courier New"/>
+                <w:sz w:val="18"/>
+                <w:szCs w:val="18"/>
+              </w:rPr>
+              <w:t>$ ls /bin | cat | cat # Multi-stage pipeline (up to 4 stages)</w:t>
+            </w:r>
+          </w:p>
+          <w:p>
+            <w:pPr>
+              <w:spacing w:line="300" w:lineRule="auto"/>
+              <w:rPr>
+                <w:rFonts w:ascii="Courier New" w:hAnsi="Courier New" w:cs="Courier New"/>
+                <w:sz w:val="18"/>
+                <w:szCs w:val="18"/>
+              </w:rPr>
+            </w:pPr>
+            <w:r>
+              <w:rPr>
+                <w:rFonts w:ascii="Courier New" w:hAnsi="Courier New" w:cs="Courier New"/>
+                <w:sz w:val="18"/>
+                <w:szCs w:val="18"/>
+              </w:rPr>
+              <w:t>$ echo hello &gt; /tmp/f  # Output redirection (creates or truncates file)</w:t>
+            </w:r>
+          </w:p>
+          <w:p>
+            <w:pPr>
+              <w:spacing w:line="300" w:lineRule="auto"/>
+              <w:rPr>
+                <w:rFonts w:ascii="Courier New" w:hAnsi="Courier New" w:cs="Courier New"/>
+                <w:sz w:val="18"/>
+                <w:szCs w:val="18"/>
+              </w:rPr>
+            </w:pPr>
+            <w:r>
+              <w:rPr>
+                <w:rFonts w:ascii="Courier New" w:hAnsi="Courier New" w:cs="Courier New"/>
+                <w:sz w:val="18"/>
+                <w:szCs w:val="18"/>
+              </w:rPr>
+              <w:t>$ cat &lt; /tmp/f        # Input redirection (read from file)</w:t>
+            </w:r>
+          </w:p>
         </w:tc>
       </w:tr>
     </w:tbl>
@@ -7417,7 +7989,7 @@
         <w:t>OS</w:t>
       </w:r>
       <w:r>
-        <w:t xml:space="preserve"> has 16. log</w:t>
+        <w:t xml:space="preserve"> has 28. log</w:t>
       </w:r>
       <w:r>
         <w:rPr>
@@ -7427,7 +7999,7 @@
         <w:t>OS</w:t>
       </w:r>
       <w:r>
-        <w:t xml:space="preserve"> omits many foundational Unix features:</w:t>
+        <w:t xml:space="preserve"> now includes preemptive multitasking, fork/exec/wait process creation, kernel-buffered pipes, I/O redirection, and multi-stage shell pipelines. Nevertheless, it still omits many features found in production Unix systems:</w:t>
       </w:r>
     </w:p>
     <w:p>
@@ -7439,10 +8011,10 @@
           <w:b/>
           <w:bCs/>
         </w:rPr>
-        <w:t xml:space="preserve">multitasking. </w:t>
-      </w:r>
-      <w:r>
-        <w:t>log</w:t>
+        <w:t>File permissions.</w:t>
+      </w:r>
+      <w:r>
+        <w:t xml:space="preserve"> Unix associates permissions (read, write, execute) with every file, controlling access based on user and group identity. log</w:t>
       </w:r>
       <w:r>
         <w:rPr>
@@ -7452,14 +8024,32 @@
         <w:t>OS</w:t>
       </w:r>
       <w:r>
-        <w:t xml:space="preserve"> 1.0 does not provide the multitasking (timesharing) required for Unix shell pipelines.</w:t>
-      </w:r>
+        <w:t xml:space="preserve"> has no concept of users or permissions.</w:t>
+      </w:r>
+    </w:p>
+    <w:p>
+      <w:pPr>
+        <w:spacing w:before="120" w:after="120"/>
+      </w:pPr>
       <w:r>
         <w:rPr>
           <w:b/>
           <w:bCs/>
         </w:rPr>
-        <w:t xml:space="preserve">   </w:t>
+        <w:t>Signals.</w:t>
+      </w:r>
+      <w:r>
+        <w:t xml:space="preserve"> Unix uses signals to notify processes of events (e.g., Ctrl-C sends SIGINT). log</w:t>
+      </w:r>
+      <w:r>
+        <w:rPr>
+          <w:i/>
+          <w:iCs/>
+        </w:rPr>
+        <w:t>OS</w:t>
+      </w:r>
+      <w:r>
+        <w:t xml:space="preserve"> has no signal mechanism.</w:t>
       </w:r>
     </w:p>
     <w:p>
@@ -7471,11 +8061,10 @@
           <w:b/>
           <w:bCs/>
         </w:rPr>
-        <w:lastRenderedPageBreak/>
-        <w:t>fork and exec.</w:t>
-      </w:r>
-      <w:r>
-        <w:t xml:space="preserve"> Unix separates process creation (fork) from program loading (exec), allowing the child to set up I/O redirection between the two calls. This, together with multitasking, enables pipelines (ls | grep foo). log</w:t>
+        <w:t>Virtual memory.</w:t>
+      </w:r>
+      <w:r>
+        <w:t xml:space="preserve"> Modern Unix systems give each process its own virtual address space via hardware page tables. log</w:t>
       </w:r>
       <w:r>
         <w:rPr>
@@ -7485,7 +8074,7 @@
         <w:t>OS</w:t>
       </w:r>
       <w:r>
-        <w:t>'s combined spawn is simpler but cannot support pipelines.</w:t>
+        <w:t xml:space="preserve"> runs on hardware without an MMU and instead uses fixed physical memory partitions.</w:t>
       </w:r>
     </w:p>
     <w:p>
@@ -7497,10 +8086,10 @@
           <w:b/>
           <w:bCs/>
         </w:rPr>
-        <w:t>Pipes.</w:t>
-      </w:r>
-      <w:r>
-        <w:t xml:space="preserve"> Unix pipes provide a unidirectional byte stream between two processes. They are the mechanism behind the | operator in the shell. log</w:t>
+        <w:t>Networking.</w:t>
+      </w:r>
+      <w:r>
+        <w:t xml:space="preserve"> Unix provides a socket API for network communication (TCP/IP). log</w:t>
       </w:r>
       <w:r>
         <w:rPr>
@@ -7510,7 +8099,7 @@
         <w:t>OS</w:t>
       </w:r>
       <w:r>
-        <w:t xml:space="preserve"> 1.0 does not implement pipes.</w:t>
+        <w:t xml:space="preserve"> has no networking support.</w:t>
       </w:r>
     </w:p>
     <w:p>
@@ -7522,10 +8111,10 @@
           <w:b/>
           <w:bCs/>
         </w:rPr>
-        <w:t>File permissions.</w:t>
-      </w:r>
-      <w:r>
-        <w:t xml:space="preserve"> Unix associates permissions (read, write, execute) with every file, controlling access based on user and group identity. log</w:t>
+        <w:t>Multiple users.</w:t>
+      </w:r>
+      <w:r>
+        <w:t xml:space="preserve"> Unix supports multiple user accounts with login, authentication, and per-user resource management. log</w:t>
       </w:r>
       <w:r>
         <w:rPr>
@@ -7535,57 +8124,7 @@
         <w:t>OS</w:t>
       </w:r>
       <w:r>
-        <w:t xml:space="preserve"> has no concept of users or permissions.</w:t>
-      </w:r>
-    </w:p>
-    <w:p>
-      <w:pPr>
-        <w:spacing w:before="120" w:after="120"/>
-      </w:pPr>
-      <w:r>
-        <w:rPr>
-          <w:b/>
-          <w:bCs/>
-        </w:rPr>
-        <w:t>Signals.</w:t>
-      </w:r>
-      <w:r>
-        <w:t xml:space="preserve"> Unix uses signals to notify processes of events (e.g., Ctrl-C sends SIGINT). log</w:t>
-      </w:r>
-      <w:r>
-        <w:rPr>
-          <w:i/>
-          <w:iCs/>
-        </w:rPr>
-        <w:t>OS</w:t>
-      </w:r>
-      <w:r>
-        <w:t xml:space="preserve"> has no signal mechanism.</w:t>
-      </w:r>
-    </w:p>
-    <w:p>
-      <w:pPr>
-        <w:spacing w:before="120" w:after="120"/>
-      </w:pPr>
-      <w:r>
-        <w:rPr>
-          <w:b/>
-          <w:bCs/>
-        </w:rPr>
-        <w:t>Virtual memory.</w:t>
-      </w:r>
-      <w:r>
-        <w:t xml:space="preserve"> Modern Unix systems give each process its own virtual address space via hardware page tables. log</w:t>
-      </w:r>
-      <w:r>
-        <w:rPr>
-          <w:i/>
-          <w:iCs/>
-        </w:rPr>
-        <w:t>OS</w:t>
-      </w:r>
-      <w:r>
-        <w:t xml:space="preserve"> runs on hardware without an MMU and instead uses fixed physical memory partitions.</w:t>
+        <w:t xml:space="preserve"> is a single-user system with no login mechanism.</w:t>
       </w:r>
     </w:p>
     <w:p>
@@ -7664,7 +8203,7 @@
         <w:t xml:space="preserve">2.  </w:t>
       </w:r>
       <w:r>
-        <w:t>The spawn() system call blocks the parent until the child exits. What advantages and disadvantages does this have compared to Unix's non-blocking fork()?</w:t>
+        <w:t>Write a program that uses fork() and pipe() to implement the equivalent of the shell command “echo hello | cat” without using the shell. The parent should create a pipe, fork two children, and wait for both.</w:t>
       </w:r>
     </w:p>
     <w:p>
@@ -7681,28 +8220,7 @@
         <w:t xml:space="preserve">3.  </w:t>
       </w:r>
       <w:r>
-        <w:t>log</w:t>
-      </w:r>
-      <w:r>
-        <w:rPr>
-          <w:i/>
-          <w:iCs/>
-        </w:rPr>
-        <w:t>OS</w:t>
-      </w:r>
-      <w:r>
-        <w:t xml:space="preserve"> has no pipe system call. How could you implement a functional equivalent of the Unix shell command </w:t>
-      </w:r>
-      <w:r>
-        <w:rPr>
-          <w:rFonts w:ascii="Courier New" w:hAnsi="Courier New" w:cs="Courier New"/>
-          <w:sz w:val="18"/>
-          <w:szCs w:val="18"/>
-        </w:rPr>
-        <w:t>ls | grep hello</w:t>
-      </w:r>
-      <w:r>
-        <w:t xml:space="preserve"> without pipes? What additional system calls would be needed?</w:t>
+        <w:t>Explain why the shell forks a child process before calling exec(), rather than calling exec() directly. What would happen if the shell called exec() without forking first?</w:t>
       </w:r>
     </w:p>
     <w:p>

</xml_diff>

<commit_message>
Update textbook header, Foreword, Ch2, Ch3 for logOS 2.0
- Header: Belfield 1.0 -> 2.0 Blackrock
- Foreword: describe preemptive multitasking, fork/exec/wait, pipes
- Ch2: add Pipes row to kernel org table, update shell description
  to fork/exec/wait, update exercises for concurrent processes
- Ch3: add timer interrupt handling to trap dispatcher, update
  Real World section for preemptive scheduling, new exercise

Co-Authored-By: Claude Opus 4.6 (1M context) <noreply@anthropic.com>
</commit_message>
<xml_diff>
--- a/textbook/logos-textbook.docx
+++ b/textbook/logos-textbook.docx
@@ -3743,7 +3743,7 @@
         <w:t>OS</w:t>
       </w:r>
       <w:r>
-        <w:t xml:space="preserve"> 1.0 does not provide preemptive multitasking and is functionally more akin to MS-DOS than modern operating systems like Linux, Windows, or macOS — a kernel reduced to its essence.</w:t>
+        <w:t xml:space="preserve"> 2.0 provides preemptive multitasking with fork, exec, and wait for process management, kernel-buffered pipes for interprocess communication, and a shell with pipelines and I/O redirection — the essential mechanisms of a Unix-like operating system.</w:t>
       </w:r>
     </w:p>
     <w:p>
@@ -3761,7 +3761,7 @@
         <w:t>OS</w:t>
       </w:r>
       <w:r>
-        <w:t xml:space="preserve"> 1.0 is deliberate. By running on a CPU simulated in Logisim, you can observe the hardware and software in a single, integrated environment. There is no MMU, so the concepts of address spaces and memory protection are replaced by the simpler (and historically older) approach of fixed memory partitions. There is no preemptive multitasking, so the complexities of concurrent scheduling and locking vanish. What remains is a clear illustration of the core mechanisms: how a system call enters the kernel, how the filesystem translates paths to data on disk, how a shell spawns programs.</w:t>
+        <w:t xml:space="preserve"> 2.0 is deliberate. By running on a CPU simulated in Logisim, you can observe the hardware and software in a single, integrated environment. There is no MMU, so the concepts of address spaces and memory protection are replaced by the simpler (and historically older) approach of fixed memory partitions. Preemptive multitasking uses a timer interrupt and round-robin scheduling, keeping the scheduler simple enough to understand completely. What remains is a clear illustration of the core mechanisms: how a system call enters the kernel, how processes are created with fork and replaced with exec, how pipes connect processes, and how a shell orchestrates it all.</w:t>
       </w:r>
     </w:p>
     <w:p>
@@ -9331,7 +9331,7 @@
                 <w:sz w:val="20"/>
                 <w:szCs w:val="20"/>
               </w:rPr>
-              <w:t>Process table, slot allocation</w:t>
+              <w:t>Process table, fork/exec/wait, scheduling</w:t>
             </w:r>
           </w:p>
         </w:tc>
@@ -9417,7 +9417,7 @@
                 <w:sz w:val="20"/>
                 <w:szCs w:val="20"/>
               </w:rPr>
-              <w:t>System call dispatch and implementation</w:t>
+              <w:t>System call dispatch, file descriptors, pipes</w:t>
             </w:r>
           </w:p>
         </w:tc>
@@ -9519,6 +9519,92 @@
               <w:right w:val="single" w:sz="1" w:space="0" w:color="C0C8D0"/>
             </w:tcBorders>
             <w:shd w:val="clear" w:color="auto" w:fill="FFFFFF"/>
+            <w:tcMar>
+              <w:top w:w="60" w:type="dxa"/>
+              <w:left w:w="100" w:type="dxa"/>
+              <w:bottom w:w="60" w:type="dxa"/>
+              <w:right w:w="100" w:type="dxa"/>
+            </w:tcMar>
+            <w:vAlign w:val="center"/>
+          </w:tcPr>
+          <w:p>
+            <w:r>
+              <w:rPr>
+                <w:sz w:val="20"/>
+                <w:szCs w:val="20"/>
+              </w:rPr>
+              <w:t>Pipes</w:t>
+            </w:r>
+          </w:p>
+        </w:tc>
+        <w:tc>
+          <w:tcPr>
+            <w:tcW w:w="3120" w:type="dxa"/>
+            <w:tcBorders>
+              <w:top w:val="single" w:sz="1" w:space="0" w:color="C0C8D0"/>
+              <w:left w:val="single" w:sz="1" w:space="0" w:color="C0C8D0"/>
+              <w:bottom w:val="single" w:sz="1" w:space="0" w:color="C0C8D0"/>
+              <w:right w:val="single" w:sz="1" w:space="0" w:color="C0C8D0"/>
+            </w:tcBorders>
+            <w:shd w:val="clear" w:color="auto" w:fill="FFFFFF"/>
+            <w:tcMar>
+              <w:top w:w="60" w:type="dxa"/>
+              <w:left w:w="100" w:type="dxa"/>
+              <w:bottom w:w="60" w:type="dxa"/>
+              <w:right w:w="100" w:type="dxa"/>
+            </w:tcMar>
+            <w:vAlign w:val="center"/>
+          </w:tcPr>
+          <w:p>
+            <w:r>
+              <w:rPr>
+                <w:sz w:val="20"/>
+                <w:szCs w:val="20"/>
+              </w:rPr>
+              <w:t>pipe.c/h</w:t>
+            </w:r>
+          </w:p>
+        </w:tc>
+        <w:tc>
+          <w:tcPr>
+            <w:tcW w:w="3120" w:type="dxa"/>
+            <w:tcBorders>
+              <w:top w:val="single" w:sz="1" w:space="0" w:color="C0C8D0"/>
+              <w:left w:val="single" w:sz="1" w:space="0" w:color="C0C8D0"/>
+              <w:bottom w:val="single" w:sz="1" w:space="0" w:color="C0C8D0"/>
+              <w:right w:val="single" w:sz="1" w:space="0" w:color="C0C8D0"/>
+            </w:tcBorders>
+            <w:shd w:val="clear" w:color="auto" w:fill="FFFFFF"/>
+            <w:tcMar>
+              <w:top w:w="60" w:type="dxa"/>
+              <w:left w:w="100" w:type="dxa"/>
+              <w:bottom w:w="60" w:type="dxa"/>
+              <w:right w:w="100" w:type="dxa"/>
+            </w:tcMar>
+            <w:vAlign w:val="center"/>
+          </w:tcPr>
+          <w:p>
+            <w:r>
+              <w:rPr>
+                <w:sz w:val="20"/>
+                <w:szCs w:val="20"/>
+              </w:rPr>
+              <w:t>Kernel-buffered IPC channels</w:t>
+            </w:r>
+          </w:p>
+        </w:tc>
+      </w:tr>
+      <w:tr>
+        <w:tc>
+          <w:tcPr>
+            <w:tcW w:w="3120" w:type="dxa"/>
+            <w:tcBorders>
+              <w:top w:val="single" w:sz="1" w:space="0" w:color="C0C8D0"/>
+              <w:left w:val="single" w:sz="1" w:space="0" w:color="C0C8D0"/>
+              <w:bottom w:val="single" w:sz="1" w:space="0" w:color="C0C8D0"/>
+              <w:right w:val="single" w:sz="1" w:space="0" w:color="C0C8D0"/>
+            </w:tcBorders>
+            <w:shd w:val="clear" w:color="auto" w:fill="F0F4F8"/>
             <w:tcMar>
               <w:top w:w="60" w:type="dxa"/>
               <w:left w:w="100" w:type="dxa"/>
@@ -10051,7 +10137,7 @@
         <w:spacing w:before="80" w:after="80"/>
       </w:pPr>
       <w:r>
-        <w:t>The shell reads user input from file descriptor 0 (STDIN), and prints responses to file descriptor 1 (STDOUT) using read() and write() system calls. If instructed to run a program, the shell starts it via the spawn() system call that loads the specified executable file into the next available process slot and transfers control to it, effectively suspending the shell until the new process finishes execution and calls exit().</w:t>
+        <w:t>The shell reads user input from file descriptor 0 (STDIN) and prints responses to file descriptor 1 (STDOUT) using read() and write() system calls. When instructed to run a program, the shell uses the Unix fork/exec/wait pattern: it calls fork() to create a child process, the child calls exec() to replace itself with the requested program, and the parent calls wait() to block until the child exits. For pipelines, the shell creates pipes between stages and uses dup2() to redirect file descriptors before calling exec() in each child.</w:t>
       </w:r>
     </w:p>
     <w:p>
@@ -10173,7 +10259,7 @@
         <w:t>OS</w:t>
       </w:r>
       <w:r>
-        <w:t xml:space="preserve"> has 8 process slots. What is the maximum depth of nested spawn() calls possible? What happens if a program tries to exceed this?</w:t>
+        <w:t xml:space="preserve"> has 8 process slots. What is the maximum number of concurrent processes? What happens when fork() is called and all slots are occupied?</w:t>
       </w:r>
     </w:p>
     <w:p>
@@ -11989,7 +12075,7 @@
           <w:sz w:val="18"/>
           <w:szCs w:val="18"/>
         </w:rPr>
-        <w:t xml:space="preserve">        printf("Unexpected interrupt\n");</w:t>
+        <w:t xml:space="preserve">        /* Timer interrupt: preemptive scheduling */</w:t>
       </w:r>
     </w:p>
     <w:p>
@@ -12034,7 +12120,7 @@
           <w:sz w:val="18"/>
           <w:szCs w:val="18"/>
         </w:rPr>
-        <w:t xml:space="preserve">        trap_ret(tf);</w:t>
+        <w:t xml:space="preserve">        schedule(tf);  /* Switch to next ready process */</w:t>
       </w:r>
     </w:p>
     <w:p>
@@ -12272,7 +12358,7 @@
         <w:spacing w:before="80" w:after="80"/>
       </w:pPr>
       <w:r>
-        <w:t>For system calls (cause 11), the handler calls syscall_dispatch (kernel/syscall.c), which reads the system call number from tf-&gt;a7 and dispatches to the appropriate handler:</w:t>
+        <w:t>The handler distinguishes two cases. For system calls (cause 11), it calls syscall_dispatch (kernel/syscall.c), which reads the system call number from tf’s a7 field and dispatches to the appropriate handler. For timer interrupts (the high bit of mcause is set), it calls schedule() to perform a context switch to the next ready process — this is how logOS implements preemptive multitasking. The syscall dispatch function is:</w:t>
       </w:r>
     </w:p>
     <w:p>
@@ -13460,7 +13546,7 @@
         <w:t>OS</w:t>
       </w:r>
       <w:r>
-        <w:t xml:space="preserve"> runs entirely in machine mode (M-mode). Production RISC-V operating systems typically run the kernel in supervisor mode (S-mode) and user programs in user mode (U-mode). S-mode uses a different set of CSRs (stvec, sepc, scause, sscratch) and the sret instruction, but the mechanism is identical.</w:t>
+        <w:t xml:space="preserve"> runs entirely in machine mode (M-mode) and uses the machine timer interrupt for preemptive scheduling. Production RISC-V operating systems typically run the kernel in supervisor mode (S-mode) and user programs in user mode (U-mode). S-mode uses a different set of CSRs (stvec, sepc, scause, sscratch) and the sret instruction, but the mechanism is identical. The timer-driven scheduling in logOS is conceptually the same as in production systems, though production schedulers use more sophisticated algorithms than round-robin.</w:t>
       </w:r>
     </w:p>
     <w:p>
@@ -13577,7 +13663,7 @@
         <w:t xml:space="preserve">5.  </w:t>
       </w:r>
       <w:r>
-        <w:t>Add a new system call getpid() that returns the current process's PID. You will need to modify syscall_nr.h, syscall.c, user/syscall.S, and user/libc.h.</w:t>
+        <w:t>The timer interrupt handler calls schedule() to switch processes. Trace through the code path from timer interrupt to context switch. What happens to the interrupted process’s registers? How does the scheduler ensure they are restored when that process runs again?</w:t>
       </w:r>
     </w:p>
     <w:p>
@@ -29937,7 +30023,7 @@
         <w:sz w:val="18"/>
         <w:szCs w:val="18"/>
       </w:rPr>
-      <w:t xml:space="preserve"> Belfield 1.0</w:t>
+      <w:t xml:space="preserve"> 2.0 Blackrock</w:t>
     </w:r>
   </w:p>
 </w:hdr>

</xml_diff>

<commit_message>
Update textbook Ch11 (Shell), Ch12 (Summary), memory layout diagram
- Ch11: Replace spawn() with fork/exec/wait in code and text,
  mark pipelines and I/O redirection as supported features,
  update exercises for 2.0 capabilities
- Ch12: Remove "preemptive scheduling" from future improvements
  (now implemented), add fork/exec/wait and pipes to summary
- Update embedded memory layout diagram for 32KB slots

Co-Authored-By: Claude Opus 4.6 (1M context) <noreply@anthropic.com>
</commit_message>
<xml_diff>
--- a/textbook/logos-textbook.docx
+++ b/textbook/logos-textbook.docx
@@ -29013,33 +29013,33 @@
           <w:sz w:val="18"/>
           <w:szCs w:val="18"/>
         </w:rPr>
-        <w:t xml:space="preserve">        /* Path contains '/' — use as-is */</w:t>
-      </w:r>
-    </w:p>
-    <w:p>
-      <w:pPr>
-        <w:pStyle w:val="HTMLPreformatted"/>
-        <w:pBdr>
-          <w:top w:val="single" w:sz="6" w:space="8" w:color="DDDDDD"/>
-          <w:left w:val="single" w:sz="6" w:space="8" w:color="DDDDDD"/>
-          <w:bottom w:val="single" w:sz="6" w:space="8" w:color="DDDDDD"/>
-          <w:right w:val="single" w:sz="6" w:space="8" w:color="DDDDDD"/>
-        </w:pBdr>
-        <w:shd w:val="clear" w:color="auto" w:fill="F5F5F5"/>
-        <w:spacing w:before="80"/>
-        <w:rPr>
-          <w:color w:val="000000"/>
-          <w:sz w:val="18"/>
-          <w:szCs w:val="18"/>
-        </w:rPr>
-      </w:pPr>
-      <w:r>
-        <w:rPr>
-          <w:color w:val="000000"/>
-          <w:sz w:val="18"/>
-          <w:szCs w:val="18"/>
-        </w:rPr>
-        <w:t xml:space="preserve">        result = spawn(argv[0], argv);</w:t>
+        <w:t xml:space="preserve">        /* Path contains '/' — fork and exec directly */</w:t>
+      </w:r>
+    </w:p>
+    <w:p>
+      <w:pPr>
+        <w:pStyle w:val="HTMLPreformatted"/>
+        <w:pBdr>
+          <w:top w:val="single" w:sz="6" w:space="8" w:color="DDDDDD"/>
+          <w:left w:val="single" w:sz="6" w:space="8" w:color="DDDDDD"/>
+          <w:bottom w:val="single" w:sz="6" w:space="8" w:color="DDDDDD"/>
+          <w:right w:val="single" w:sz="6" w:space="8" w:color="DDDDDD"/>
+        </w:pBdr>
+        <w:shd w:val="clear" w:color="auto" w:fill="F5F5F5"/>
+        <w:spacing w:before="80"/>
+        <w:rPr>
+          <w:color w:val="000000"/>
+          <w:sz w:val="18"/>
+          <w:szCs w:val="18"/>
+        </w:rPr>
+      </w:pPr>
+      <w:r>
+        <w:rPr>
+          <w:color w:val="000000"/>
+          <w:sz w:val="18"/>
+          <w:szCs w:val="18"/>
+        </w:rPr>
+        <w:t xml:space="preserve">        pid = fork();</w:t>
       </w:r>
     </w:p>
     <w:p>
@@ -29091,7 +29091,7 @@
           <w:sz w:val="18"/>
           <w:szCs w:val="18"/>
         </w:rPr>
-        <w:t xml:space="preserve">        /* Search PATH directories */</w:t>
+        <w:t xml:space="preserve">        /* Fork, then search PATH and exec in child */</w:t>
       </w:r>
     </w:p>
     <w:p>
@@ -29195,7 +29195,7 @@
           <w:sz w:val="18"/>
           <w:szCs w:val="18"/>
         </w:rPr>
-        <w:t xml:space="preserve">         *   result = spawn(path, argv);</w:t>
+        <w:t xml:space="preserve">         *   exec(path, argv);</w:t>
       </w:r>
     </w:p>
     <w:p>
@@ -29289,7 +29289,7 @@
         <w:spacing w:before="80" w:after="80"/>
       </w:pPr>
       <w:r>
-        <w:t>If the command contains a /, it is treated as a path and used directly. Otherwise, the shell tries each directory in PATH in order. For example, with PATH=/bin, typing hello causes the shell to try spawn("/bin/hello", argv).</w:t>
+        <w:t>If the command contains a /, it is treated as a path and used directly. Otherwise, the shell tries each directory in PATH in order. For example, with PATH=/bin, typing hello causes the shell to try /bin/hello. The shell uses the fork/exec/wait pattern: fork() creates a child process, the child calls exec() to run the command, and the parent calls wait() to block until the child finishes.</w:t>
       </w:r>
     </w:p>
     <w:p>
@@ -29297,7 +29297,7 @@
         <w:spacing w:before="80" w:after="80"/>
       </w:pPr>
       <w:r>
-        <w:t>The spawn() call blocks until the child exits and returns the child's exit code. The shell stores this in the ? environment variable so the user can inspect it with echo $?.</w:t>
+        <w:t>The wait() call blocks until the child exits and returns the child’s exit code. The shell stores this in the ? environment variable so the user can inspect it with echo $?. The separation of fork and exec allows the child to modify its file descriptors before calling exec, which is how the shell implements I/O redirection and pipelines.</w:t>
       </w:r>
     </w:p>
     <w:p>
@@ -29341,7 +29341,7 @@
           <w:b/>
           <w:bCs/>
         </w:rPr>
-        <w:t>Pipelines:</w:t>
+        <w:t>Pipelines (supported):</w:t>
       </w:r>
       <w:r>
         <w:t xml:space="preserve"> ls | grep foo | wc -l</w:t>
@@ -29363,7 +29363,7 @@
           <w:b/>
           <w:bCs/>
         </w:rPr>
-        <w:t>I/O redirection:</w:t>
+        <w:t>I/O redirection (supported):</w:t>
       </w:r>
       <w:r>
         <w:t xml:space="preserve"> echo hello &gt; file.txt</w:t>
@@ -29517,7 +29517,7 @@
         <w:t>OS</w:t>
       </w:r>
       <w:r>
-        <w:t xml:space="preserve"> shell supports none of these, but the simplicity makes it easy to understand the fundamental loop: read, parse, execute.</w:t>
+        <w:t xml:space="preserve"> shell now supports pipelines (up to 4 stages), I/O redirection (&gt;, &gt;&gt;, &lt;), and environment variables. Background execution, job control, scripting, quoting, globbing, and tab completion remain unimplemented, but the shell demonstrates the essential Unix pattern: fork, redirect, exec.</w:t>
       </w:r>
     </w:p>
     <w:p>
@@ -29568,7 +29568,7 @@
         <w:t xml:space="preserve">2.  </w:t>
       </w:r>
       <w:r>
-        <w:t>Add a type command that reads a file and prints its contents (like cat), using open, read, write, and close.</w:t>
+        <w:t>Implement background execution with &amp; (e.g., sleep 10 &amp;). The shell should fork the child but not call wait() immediately. What happens to the child when it exits if no one calls wait()?</w:t>
       </w:r>
     </w:p>
     <w:p>
@@ -29619,17 +29619,7 @@
         <w:t xml:space="preserve">5.  </w:t>
       </w:r>
       <w:r>
-        <w:t>Implement I/O redirection (&gt;) in the shell. What additional system calls would log</w:t>
-      </w:r>
-      <w:r>
-        <w:rPr>
-          <w:i/>
-          <w:iCs/>
-        </w:rPr>
-        <w:t>OS</w:t>
-      </w:r>
-      <w:r>
-        <w:t xml:space="preserve"> need to support this?</w:t>
+        <w:t>The shell supports up to 4 pipeline stages. What limits this number? Modify the shell to support an arbitrary number of stages. What resource limits would you encounter?</w:t>
       </w:r>
     </w:p>
     <w:p>
@@ -29693,7 +29683,7 @@
         <w:spacing w:before="80" w:after="80"/>
       </w:pPr>
       <w:r>
-        <w:t>Other code lines provide an illustration of how to implement a particular operating system idea and could easily be done differently. A better filesystem might use B-trees for directory lookup. A better process model might support preemptive scheduling. A better memory model might use virtual address spaces with hardware protection. These are all important topics that log</w:t>
+        <w:t>Other code lines provide an illustration of how to implement a particular operating system idea and could easily be done differently. A better filesystem might use B-trees for directory lookup. A better memory model might use virtual address spaces with hardware protection. These are important topics that log</w:t>
       </w:r>
       <w:r>
         <w:rPr>
@@ -29755,7 +29745,7 @@
         <w:t>Processes</w:t>
       </w:r>
       <w:r>
-        <w:t xml:space="preserve"> as the kernel's abstraction for running programs, each with its own memory, file descriptors, environment, and saved register state.</w:t>
+        <w:t xml:space="preserve"> as the kernel’s abstraction for running programs, each with its own memory, file descriptors, environment, and saved register state. Fork, exec, and wait provide the Unix model for process creation.</w:t>
       </w:r>
     </w:p>
     <w:p>
@@ -29843,7 +29833,7 @@
         <w:t>The shell</w:t>
       </w:r>
       <w:r>
-        <w:t xml:space="preserve"> as a demonstration that powerful functionality can be built entirely in user space, using only the system call interface.</w:t>
+        <w:t xml:space="preserve"> as a demonstration that powerful functionality — including pipelines and I/O redirection — can be built entirely in user space, using only the system call interface.</w:t>
       </w:r>
     </w:p>
     <w:p>
@@ -29861,7 +29851,7 @@
         <w:t>OS</w:t>
       </w:r>
       <w:r>
-        <w:t xml:space="preserve"> works — from the first instruction after power-on to the shell prompt — provides a foundation for studying any operating system, from embedded systems to the world's largest servers.</w:t>
+        <w:t xml:space="preserve"> works — from the first instruction after power-on, through preemptive multitasking and pipe-connected pipelines, to the shell prompt — provides a foundation for studying any operating system, from embedded systems to the world’s largest servers.</w:t>
       </w:r>
     </w:p>
     <w:sectPr>

</xml_diff>

<commit_message>
Update memory layout diagram and textbook for 32KB slots
- Fix filesystem layout: 256 blocks -> 512 blocks (matches Makefile)
- Fix inode table: blocks 2-5 -> blocks 2-9, data_start 6 -> 10
- Add link_count field to inode struct (replaces reserved byte)
- Update inode_blocks comment from 4 to 8
- Regenerate filesystem layout diagram (logos-fs-layout.png)
- Fix "128KB filesystem" -> "256KB filesystem" in Chapter 8

Co-Authored-By: Claude Opus 4.6 (1M context) <noreply@anthropic.com>
</commit_message>
<xml_diff>
--- a/textbook/logos-textbook.docx
+++ b/textbook/logos-textbook.docx
@@ -19854,7 +19854,7 @@
         <w:spacing w:before="80" w:after="80"/>
       </w:pPr>
       <w:r>
-        <w:t>The filesystem occupies 256 blocks of 512 bytes each (128KB total). The blocks are organized as follows:</w:t>
+        <w:t>The filesystem occupies 512 blocks of 512 bytes each (256KB total). The blocks are organized as follows:</w:t>
       </w:r>
     </w:p>
     <w:p>
@@ -19893,7 +19893,7 @@
         <w:spacing w:before="80" w:after="80"/>
       </w:pPr>
       <w:r>
-        <w:t>Blocks 2-5 Inode table (32 inodes x 128 bytes = 8 per block)</w:t>
+        <w:t>Blocks 2-9 Inode table (32 inodes x 128 bytes = 4 per block)</w:t>
       </w:r>
     </w:p>
     <w:p>
@@ -19906,7 +19906,7 @@
         <w:spacing w:before="80" w:after="80"/>
       </w:pPr>
       <w:r>
-        <w:t>Blocks 6-255 Data blocks (for file/directory contents)</w:t>
+        <w:t>Blocks 10-511 Data blocks (for file/directory contents)</w:t>
       </w:r>
     </w:p>
     <w:p>
@@ -20095,7 +20095,7 @@
                 <w:sz w:val="18"/>
                 <w:szCs w:val="18"/>
               </w:rPr>
-              <w:t xml:space="preserve">    uint32_t total_blocks; /* 256 */</w:t>
+              <w:t xml:space="preserve">    uint32_t total_blocks; /* 512 */</w:t>
             </w:r>
             <w:r>
               <w:br/>
@@ -20179,7 +20179,7 @@
                 <w:sz w:val="18"/>
                 <w:szCs w:val="18"/>
               </w:rPr>
-              <w:t xml:space="preserve">    uint32_t inode_blocks; /* Blocks in inode table (4) */</w:t>
+              <w:t xml:space="preserve">    uint32_t inode_blocks; /* Blocks in inode table (8) */</w:t>
             </w:r>
             <w:r>
               <w:br/>
@@ -21335,7 +21335,7 @@
                 <w:sz w:val="18"/>
                 <w:szCs w:val="18"/>
               </w:rPr>
-              <w:t xml:space="preserve">    uint8_t reserved;</w:t>
+              <w:t xml:space="preserve">    uint8_t link_count;</w:t>
             </w:r>
             <w:r>
               <w:br/>
@@ -21385,7 +21385,7 @@
         <w:t>OS</w:t>
       </w:r>
       <w:r>
-        <w:t>'s 128KB filesystem, this is more than sufficient.</w:t>
+        <w:t>'s 256KB filesystem, this is more than sufficient.</w:t>
       </w:r>
     </w:p>
     <w:p>

</xml_diff>

<commit_message>
Update textbook Ch7: ls with type/size, accurate ed commands
- Add ls description: readdir() + stat() for type/size/name display
- Update ps description: parent PID and program name
- Rewrite ed command reference with accurate syntax:
  o/w take filename, <n>i/<n>a require line number,
  "." on a new line ends text input, h for help
- Add Ctrl-D mention to cat description

Co-Authored-By: Claude Opus 4.6 (1M context) <noreply@anthropic.com>
</commit_message>
<xml_diff>
--- a/textbook/logos-textbook.docx
+++ b/textbook/logos-textbook.docx
@@ -272,7 +272,7 @@
               <w:fldChar w:fldCharType="begin"/>
               <w:instrText xml:space="preserve"> PAGEREF _Toc225090794 \h </w:instrText>
               <w:fldChar w:fldCharType="separate"/>
-              <w:t>8</w:t>
+              <w:t>9</w:t>
               <w:fldChar w:fldCharType="end"/>
             </w:r>
           </w:hyperlink>
@@ -309,7 +309,7 @@
               <w:fldChar w:fldCharType="begin"/>
               <w:instrText xml:space="preserve"> PAGEREF _Toc225090795 \h </w:instrText>
               <w:fldChar w:fldCharType="separate"/>
-              <w:t>10</w:t>
+              <w:t>11</w:t>
               <w:fldChar w:fldCharType="end"/>
             </w:r>
           </w:hyperlink>
@@ -346,7 +346,7 @@
               <w:fldChar w:fldCharType="begin"/>
               <w:instrText xml:space="preserve"> PAGEREF _Toc225090796 \h </w:instrText>
               <w:fldChar w:fldCharType="separate"/>
-              <w:t>11</w:t>
+              <w:t>12</w:t>
               <w:fldChar w:fldCharType="end"/>
             </w:r>
           </w:hyperlink>
@@ -420,7 +420,7 @@
               <w:fldChar w:fldCharType="begin"/>
               <w:instrText xml:space="preserve"> PAGEREF _Toc225090798 \h </w:instrText>
               <w:fldChar w:fldCharType="separate"/>
-              <w:t>12</w:t>
+              <w:t>13</w:t>
               <w:fldChar w:fldCharType="end"/>
             </w:r>
           </w:hyperlink>
@@ -457,7 +457,7 @@
               <w:fldChar w:fldCharType="begin"/>
               <w:instrText xml:space="preserve"> PAGEREF _Toc225090799 \h </w:instrText>
               <w:fldChar w:fldCharType="separate"/>
-              <w:t>12</w:t>
+              <w:t>13</w:t>
               <w:fldChar w:fldCharType="end"/>
             </w:r>
           </w:hyperlink>
@@ -494,7 +494,7 @@
               <w:fldChar w:fldCharType="begin"/>
               <w:instrText xml:space="preserve"> PAGEREF _Toc225090800 \h </w:instrText>
               <w:fldChar w:fldCharType="separate"/>
-              <w:t>13</w:t>
+              <w:t>14</w:t>
               <w:fldChar w:fldCharType="end"/>
             </w:r>
           </w:hyperlink>
@@ -531,7 +531,7 @@
               <w:fldChar w:fldCharType="begin"/>
               <w:instrText xml:space="preserve"> PAGEREF _Toc225090801 \h </w:instrText>
               <w:fldChar w:fldCharType="separate"/>
-              <w:t>14</w:t>
+              <w:t>15</w:t>
               <w:fldChar w:fldCharType="end"/>
             </w:r>
           </w:hyperlink>
@@ -568,7 +568,7 @@
               <w:fldChar w:fldCharType="begin"/>
               <w:instrText xml:space="preserve"> PAGEREF _Toc225090802 \h </w:instrText>
               <w:fldChar w:fldCharType="separate"/>
-              <w:t>15</w:t>
+              <w:t>17</w:t>
               <w:fldChar w:fldCharType="end"/>
             </w:r>
           </w:hyperlink>
@@ -605,7 +605,7 @@
               <w:fldChar w:fldCharType="begin"/>
               <w:instrText xml:space="preserve"> PAGEREF _Toc225090803 \h </w:instrText>
               <w:fldChar w:fldCharType="separate"/>
-              <w:t>15</w:t>
+              <w:t>17</w:t>
               <w:fldChar w:fldCharType="end"/>
             </w:r>
           </w:hyperlink>
@@ -642,7 +642,7 @@
               <w:fldChar w:fldCharType="begin"/>
               <w:instrText xml:space="preserve"> PAGEREF _Toc225090804 \h </w:instrText>
               <w:fldChar w:fldCharType="separate"/>
-              <w:t>15</w:t>
+              <w:t>17</w:t>
               <w:fldChar w:fldCharType="end"/>
             </w:r>
           </w:hyperlink>
@@ -679,7 +679,7 @@
               <w:fldChar w:fldCharType="begin"/>
               <w:instrText xml:space="preserve"> PAGEREF _Toc225090805 \h </w:instrText>
               <w:fldChar w:fldCharType="separate"/>
-              <w:t>16</w:t>
+              <w:t>18</w:t>
               <w:fldChar w:fldCharType="end"/>
             </w:r>
           </w:hyperlink>
@@ -716,7 +716,7 @@
               <w:fldChar w:fldCharType="begin"/>
               <w:instrText xml:space="preserve"> PAGEREF _Toc225090806 \h </w:instrText>
               <w:fldChar w:fldCharType="separate"/>
-              <w:t>18</w:t>
+              <w:t>20</w:t>
               <w:fldChar w:fldCharType="end"/>
             </w:r>
           </w:hyperlink>
@@ -753,7 +753,7 @@
               <w:fldChar w:fldCharType="begin"/>
               <w:instrText xml:space="preserve"> PAGEREF _Toc225090807 \h </w:instrText>
               <w:fldChar w:fldCharType="separate"/>
-              <w:t>19</w:t>
+              <w:t>21</w:t>
               <w:fldChar w:fldCharType="end"/>
             </w:r>
           </w:hyperlink>
@@ -790,7 +790,7 @@
               <w:fldChar w:fldCharType="begin"/>
               <w:instrText xml:space="preserve"> PAGEREF _Toc225090808 \h </w:instrText>
               <w:fldChar w:fldCharType="separate"/>
-              <w:t>19</w:t>
+              <w:t>21</w:t>
               <w:fldChar w:fldCharType="end"/>
             </w:r>
           </w:hyperlink>
@@ -827,7 +827,7 @@
               <w:fldChar w:fldCharType="begin"/>
               <w:instrText xml:space="preserve"> PAGEREF _Toc225090809 \h </w:instrText>
               <w:fldChar w:fldCharType="separate"/>
-              <w:t>21</w:t>
+              <w:t>23</w:t>
               <w:fldChar w:fldCharType="end"/>
             </w:r>
           </w:hyperlink>
@@ -864,7 +864,7 @@
               <w:fldChar w:fldCharType="begin"/>
               <w:instrText xml:space="preserve"> PAGEREF _Toc225090810 \h </w:instrText>
               <w:fldChar w:fldCharType="separate"/>
-              <w:t>21</w:t>
+              <w:t>23</w:t>
               <w:fldChar w:fldCharType="end"/>
             </w:r>
           </w:hyperlink>
@@ -901,7 +901,7 @@
               <w:fldChar w:fldCharType="begin"/>
               <w:instrText xml:space="preserve"> PAGEREF _Toc225090811 \h </w:instrText>
               <w:fldChar w:fldCharType="separate"/>
-              <w:t>22</w:t>
+              <w:t>24</w:t>
               <w:fldChar w:fldCharType="end"/>
             </w:r>
           </w:hyperlink>
@@ -938,7 +938,7 @@
               <w:fldChar w:fldCharType="begin"/>
               <w:instrText xml:space="preserve"> PAGEREF _Toc225090812 \h </w:instrText>
               <w:fldChar w:fldCharType="separate"/>
-              <w:t>22</w:t>
+              <w:t>24</w:t>
               <w:fldChar w:fldCharType="end"/>
             </w:r>
           </w:hyperlink>
@@ -975,7 +975,7 @@
               <w:fldChar w:fldCharType="begin"/>
               <w:instrText xml:space="preserve"> PAGEREF _Toc225090813 \h </w:instrText>
               <w:fldChar w:fldCharType="separate"/>
-              <w:t>23</w:t>
+              <w:t>25</w:t>
               <w:fldChar w:fldCharType="end"/>
             </w:r>
           </w:hyperlink>
@@ -1012,7 +1012,7 @@
               <w:fldChar w:fldCharType="begin"/>
               <w:instrText xml:space="preserve"> PAGEREF _Toc225090814 \h </w:instrText>
               <w:fldChar w:fldCharType="separate"/>
-              <w:t>24</w:t>
+              <w:t>26</w:t>
               <w:fldChar w:fldCharType="end"/>
             </w:r>
           </w:hyperlink>
@@ -1049,7 +1049,7 @@
               <w:fldChar w:fldCharType="begin"/>
               <w:instrText xml:space="preserve"> PAGEREF _Toc225090815 \h </w:instrText>
               <w:fldChar w:fldCharType="separate"/>
-              <w:t>26</w:t>
+              <w:t>28</w:t>
               <w:fldChar w:fldCharType="end"/>
             </w:r>
           </w:hyperlink>
@@ -1086,7 +1086,7 @@
               <w:fldChar w:fldCharType="begin"/>
               <w:instrText xml:space="preserve"> PAGEREF _Toc225090816 \h </w:instrText>
               <w:fldChar w:fldCharType="separate"/>
-              <w:t>26</w:t>
+              <w:t>28</w:t>
               <w:fldChar w:fldCharType="end"/>
             </w:r>
           </w:hyperlink>
@@ -1123,7 +1123,7 @@
               <w:fldChar w:fldCharType="begin"/>
               <w:instrText xml:space="preserve"> PAGEREF _Toc225090817 \h </w:instrText>
               <w:fldChar w:fldCharType="separate"/>
-              <w:t>27</w:t>
+              <w:t>29</w:t>
               <w:fldChar w:fldCharType="end"/>
             </w:r>
           </w:hyperlink>
@@ -1160,7 +1160,7 @@
               <w:fldChar w:fldCharType="begin"/>
               <w:instrText xml:space="preserve"> PAGEREF _Toc225090818 \h </w:instrText>
               <w:fldChar w:fldCharType="separate"/>
-              <w:t>27</w:t>
+              <w:t>29</w:t>
               <w:fldChar w:fldCharType="end"/>
             </w:r>
           </w:hyperlink>
@@ -1197,7 +1197,7 @@
               <w:fldChar w:fldCharType="begin"/>
               <w:instrText xml:space="preserve"> PAGEREF _Toc225090819 \h </w:instrText>
               <w:fldChar w:fldCharType="separate"/>
-              <w:t>27</w:t>
+              <w:t>29</w:t>
               <w:fldChar w:fldCharType="end"/>
             </w:r>
           </w:hyperlink>
@@ -1234,7 +1234,7 @@
               <w:fldChar w:fldCharType="begin"/>
               <w:instrText xml:space="preserve"> PAGEREF _Toc225090820 \h </w:instrText>
               <w:fldChar w:fldCharType="separate"/>
-              <w:t>29</w:t>
+              <w:t>31</w:t>
               <w:fldChar w:fldCharType="end"/>
             </w:r>
           </w:hyperlink>
@@ -1271,7 +1271,7 @@
               <w:fldChar w:fldCharType="begin"/>
               <w:instrText xml:space="preserve"> PAGEREF _Toc225090821 \h </w:instrText>
               <w:fldChar w:fldCharType="separate"/>
-              <w:t>29</w:t>
+              <w:t>31</w:t>
               <w:fldChar w:fldCharType="end"/>
             </w:r>
           </w:hyperlink>
@@ -1308,7 +1308,7 @@
               <w:fldChar w:fldCharType="begin"/>
               <w:instrText xml:space="preserve"> PAGEREF _Toc225090822 \h </w:instrText>
               <w:fldChar w:fldCharType="separate"/>
-              <w:t>30</w:t>
+              <w:t>32</w:t>
               <w:fldChar w:fldCharType="end"/>
             </w:r>
           </w:hyperlink>
@@ -1345,7 +1345,7 @@
               <w:fldChar w:fldCharType="begin"/>
               <w:instrText xml:space="preserve"> PAGEREF _Toc225090823 \h </w:instrText>
               <w:fldChar w:fldCharType="separate"/>
-              <w:t>30</w:t>
+              <w:t>32</w:t>
               <w:fldChar w:fldCharType="end"/>
             </w:r>
           </w:hyperlink>
@@ -1382,7 +1382,7 @@
               <w:fldChar w:fldCharType="begin"/>
               <w:instrText xml:space="preserve"> PAGEREF _Toc225090824 \h </w:instrText>
               <w:fldChar w:fldCharType="separate"/>
-              <w:t>31</w:t>
+              <w:t>33</w:t>
               <w:fldChar w:fldCharType="end"/>
             </w:r>
           </w:hyperlink>
@@ -1419,7 +1419,7 @@
               <w:fldChar w:fldCharType="begin"/>
               <w:instrText xml:space="preserve"> PAGEREF _Toc225090825 \h </w:instrText>
               <w:fldChar w:fldCharType="separate"/>
-              <w:t>32</w:t>
+              <w:t>34</w:t>
               <w:fldChar w:fldCharType="end"/>
             </w:r>
           </w:hyperlink>
@@ -1456,7 +1456,7 @@
               <w:fldChar w:fldCharType="begin"/>
               <w:instrText xml:space="preserve"> PAGEREF _Toc225090826 \h </w:instrText>
               <w:fldChar w:fldCharType="separate"/>
-              <w:t>33</w:t>
+              <w:t>35</w:t>
               <w:fldChar w:fldCharType="end"/>
             </w:r>
           </w:hyperlink>
@@ -1493,7 +1493,7 @@
               <w:fldChar w:fldCharType="begin"/>
               <w:instrText xml:space="preserve"> PAGEREF _Toc225090827 \h </w:instrText>
               <w:fldChar w:fldCharType="separate"/>
-              <w:t>33</w:t>
+              <w:t>35</w:t>
               <w:fldChar w:fldCharType="end"/>
             </w:r>
           </w:hyperlink>
@@ -1530,7 +1530,7 @@
               <w:fldChar w:fldCharType="begin"/>
               <w:instrText xml:space="preserve"> PAGEREF _Toc225090828 \h </w:instrText>
               <w:fldChar w:fldCharType="separate"/>
-              <w:t>34</w:t>
+              <w:t>36</w:t>
               <w:fldChar w:fldCharType="end"/>
             </w:r>
           </w:hyperlink>
@@ -1567,7 +1567,7 @@
               <w:fldChar w:fldCharType="begin"/>
               <w:instrText xml:space="preserve"> PAGEREF _Toc225090829 \h </w:instrText>
               <w:fldChar w:fldCharType="separate"/>
-              <w:t>34</w:t>
+              <w:t>36</w:t>
               <w:fldChar w:fldCharType="end"/>
             </w:r>
           </w:hyperlink>
@@ -1604,7 +1604,7 @@
               <w:fldChar w:fldCharType="begin"/>
               <w:instrText xml:space="preserve"> PAGEREF _Toc225090830 \h </w:instrText>
               <w:fldChar w:fldCharType="separate"/>
-              <w:t>34</w:t>
+              <w:t>36</w:t>
               <w:fldChar w:fldCharType="end"/>
             </w:r>
           </w:hyperlink>
@@ -1641,7 +1641,7 @@
               <w:fldChar w:fldCharType="begin"/>
               <w:instrText xml:space="preserve"> PAGEREF _Toc225090831 \h </w:instrText>
               <w:fldChar w:fldCharType="separate"/>
-              <w:t>36</w:t>
+              <w:t>38</w:t>
               <w:fldChar w:fldCharType="end"/>
             </w:r>
           </w:hyperlink>
@@ -1678,7 +1678,7 @@
               <w:fldChar w:fldCharType="begin"/>
               <w:instrText xml:space="preserve"> PAGEREF _Toc225090832 \h </w:instrText>
               <w:fldChar w:fldCharType="separate"/>
-              <w:t>36</w:t>
+              <w:t>38</w:t>
               <w:fldChar w:fldCharType="end"/>
             </w:r>
           </w:hyperlink>
@@ -1715,7 +1715,7 @@
               <w:fldChar w:fldCharType="begin"/>
               <w:instrText xml:space="preserve"> PAGEREF _Toc225090833 \h </w:instrText>
               <w:fldChar w:fldCharType="separate"/>
-              <w:t>36</w:t>
+              <w:t>38</w:t>
               <w:fldChar w:fldCharType="end"/>
             </w:r>
           </w:hyperlink>
@@ -1752,7 +1752,7 @@
               <w:fldChar w:fldCharType="begin"/>
               <w:instrText xml:space="preserve"> PAGEREF _Toc225090834 \h </w:instrText>
               <w:fldChar w:fldCharType="separate"/>
-              <w:t>37</w:t>
+              <w:t>39</w:t>
               <w:fldChar w:fldCharType="end"/>
             </w:r>
           </w:hyperlink>
@@ -1789,7 +1789,7 @@
               <w:fldChar w:fldCharType="begin"/>
               <w:instrText xml:space="preserve"> PAGEREF _Toc225090835 \h </w:instrText>
               <w:fldChar w:fldCharType="separate"/>
-              <w:t>38</w:t>
+              <w:t>40</w:t>
               <w:fldChar w:fldCharType="end"/>
             </w:r>
           </w:hyperlink>
@@ -1826,7 +1826,7 @@
               <w:fldChar w:fldCharType="begin"/>
               <w:instrText xml:space="preserve"> PAGEREF _Toc225090836 \h </w:instrText>
               <w:fldChar w:fldCharType="separate"/>
-              <w:t>38</w:t>
+              <w:t>40</w:t>
               <w:fldChar w:fldCharType="end"/>
             </w:r>
           </w:hyperlink>
@@ -1863,7 +1863,7 @@
               <w:fldChar w:fldCharType="begin"/>
               <w:instrText xml:space="preserve"> PAGEREF _Toc225090837 \h </w:instrText>
               <w:fldChar w:fldCharType="separate"/>
-              <w:t>39</w:t>
+              <w:t>41</w:t>
               <w:fldChar w:fldCharType="end"/>
             </w:r>
           </w:hyperlink>
@@ -1900,7 +1900,7 @@
               <w:fldChar w:fldCharType="begin"/>
               <w:instrText xml:space="preserve"> PAGEREF _Toc225090838 \h </w:instrText>
               <w:fldChar w:fldCharType="separate"/>
-              <w:t>40</w:t>
+              <w:t>42</w:t>
               <w:fldChar w:fldCharType="end"/>
             </w:r>
           </w:hyperlink>
@@ -1937,7 +1937,7 @@
               <w:fldChar w:fldCharType="begin"/>
               <w:instrText xml:space="preserve"> PAGEREF _Toc225090839 \h </w:instrText>
               <w:fldChar w:fldCharType="separate"/>
-              <w:t>40</w:t>
+              <w:t>42</w:t>
               <w:fldChar w:fldCharType="end"/>
             </w:r>
           </w:hyperlink>
@@ -1974,7 +1974,7 @@
               <w:fldChar w:fldCharType="begin"/>
               <w:instrText xml:space="preserve"> PAGEREF _Toc225090840 \h </w:instrText>
               <w:fldChar w:fldCharType="separate"/>
-              <w:t>40</w:t>
+              <w:t>42</w:t>
               <w:fldChar w:fldCharType="end"/>
             </w:r>
           </w:hyperlink>
@@ -2011,7 +2011,7 @@
               <w:fldChar w:fldCharType="begin"/>
               <w:instrText xml:space="preserve"> PAGEREF _Toc225090841 \h </w:instrText>
               <w:fldChar w:fldCharType="separate"/>
-              <w:t>41</w:t>
+              <w:t>43</w:t>
               <w:fldChar w:fldCharType="end"/>
             </w:r>
           </w:hyperlink>
@@ -2048,7 +2048,7 @@
               <w:fldChar w:fldCharType="begin"/>
               <w:instrText xml:space="preserve"> PAGEREF _Toc225090842 \h </w:instrText>
               <w:fldChar w:fldCharType="separate"/>
-              <w:t>41</w:t>
+              <w:t>43</w:t>
               <w:fldChar w:fldCharType="end"/>
             </w:r>
           </w:hyperlink>
@@ -2085,7 +2085,7 @@
               <w:fldChar w:fldCharType="begin"/>
               <w:instrText xml:space="preserve"> PAGEREF _Toc225090843 \h </w:instrText>
               <w:fldChar w:fldCharType="separate"/>
-              <w:t>42</w:t>
+              <w:t>44</w:t>
               <w:fldChar w:fldCharType="end"/>
             </w:r>
           </w:hyperlink>
@@ -2122,7 +2122,7 @@
               <w:fldChar w:fldCharType="begin"/>
               <w:instrText xml:space="preserve"> PAGEREF _Toc225090844 \h </w:instrText>
               <w:fldChar w:fldCharType="separate"/>
-              <w:t>42</w:t>
+              <w:t>44</w:t>
               <w:fldChar w:fldCharType="end"/>
             </w:r>
           </w:hyperlink>
@@ -2159,7 +2159,7 @@
               <w:fldChar w:fldCharType="begin"/>
               <w:instrText xml:space="preserve"> PAGEREF _Toc225090845 \h </w:instrText>
               <w:fldChar w:fldCharType="separate"/>
-              <w:t>42</w:t>
+              <w:t>44</w:t>
               <w:fldChar w:fldCharType="end"/>
             </w:r>
           </w:hyperlink>
@@ -2196,7 +2196,7 @@
               <w:fldChar w:fldCharType="begin"/>
               <w:instrText xml:space="preserve"> PAGEREF _Toc225090846 \h </w:instrText>
               <w:fldChar w:fldCharType="separate"/>
-              <w:t>44</w:t>
+              <w:t>46</w:t>
               <w:fldChar w:fldCharType="end"/>
             </w:r>
           </w:hyperlink>
@@ -2233,7 +2233,7 @@
               <w:fldChar w:fldCharType="begin"/>
               <w:instrText xml:space="preserve"> PAGEREF _Toc225090847 \h </w:instrText>
               <w:fldChar w:fldCharType="separate"/>
-              <w:t>44</w:t>
+              <w:t>46</w:t>
               <w:fldChar w:fldCharType="end"/>
             </w:r>
           </w:hyperlink>
@@ -2270,7 +2270,7 @@
               <w:fldChar w:fldCharType="begin"/>
               <w:instrText xml:space="preserve"> PAGEREF _Toc225090848 \h </w:instrText>
               <w:fldChar w:fldCharType="separate"/>
-              <w:t>45</w:t>
+              <w:t>47</w:t>
               <w:fldChar w:fldCharType="end"/>
             </w:r>
           </w:hyperlink>
@@ -2307,7 +2307,7 @@
               <w:fldChar w:fldCharType="begin"/>
               <w:instrText xml:space="preserve"> PAGEREF _Toc225090849 \h </w:instrText>
               <w:fldChar w:fldCharType="separate"/>
-              <w:t>45</w:t>
+              <w:t>47</w:t>
               <w:fldChar w:fldCharType="end"/>
             </w:r>
           </w:hyperlink>
@@ -2344,7 +2344,7 @@
               <w:fldChar w:fldCharType="begin"/>
               <w:instrText xml:space="preserve"> PAGEREF _Toc225090850 \h </w:instrText>
               <w:fldChar w:fldCharType="separate"/>
-              <w:t>45</w:t>
+              <w:t>47</w:t>
               <w:fldChar w:fldCharType="end"/>
             </w:r>
           </w:hyperlink>
@@ -2381,7 +2381,7 @@
               <w:fldChar w:fldCharType="begin"/>
               <w:instrText xml:space="preserve"> PAGEREF _Toc225090851 \h </w:instrText>
               <w:fldChar w:fldCharType="separate"/>
-              <w:t>45</w:t>
+              <w:t>47</w:t>
               <w:fldChar w:fldCharType="end"/>
             </w:r>
           </w:hyperlink>
@@ -2418,7 +2418,7 @@
               <w:fldChar w:fldCharType="begin"/>
               <w:instrText xml:space="preserve"> PAGEREF _Toc225090852 \h </w:instrText>
               <w:fldChar w:fldCharType="separate"/>
-              <w:t>46</w:t>
+              <w:t>48</w:t>
               <w:fldChar w:fldCharType="end"/>
             </w:r>
           </w:hyperlink>
@@ -2455,7 +2455,7 @@
               <w:fldChar w:fldCharType="begin"/>
               <w:instrText xml:space="preserve"> PAGEREF _Toc225090853 \h </w:instrText>
               <w:fldChar w:fldCharType="separate"/>
-              <w:t>46</w:t>
+              <w:t>48</w:t>
               <w:fldChar w:fldCharType="end"/>
             </w:r>
           </w:hyperlink>
@@ -2492,7 +2492,7 @@
               <w:fldChar w:fldCharType="begin"/>
               <w:instrText xml:space="preserve"> PAGEREF _Toc225090854 \h </w:instrText>
               <w:fldChar w:fldCharType="separate"/>
-              <w:t>47</w:t>
+              <w:t>49</w:t>
               <w:fldChar w:fldCharType="end"/>
             </w:r>
           </w:hyperlink>
@@ -2529,7 +2529,7 @@
               <w:fldChar w:fldCharType="begin"/>
               <w:instrText xml:space="preserve"> PAGEREF _Toc225090855 \h </w:instrText>
               <w:fldChar w:fldCharType="separate"/>
-              <w:t>47</w:t>
+              <w:t>49</w:t>
               <w:fldChar w:fldCharType="end"/>
             </w:r>
           </w:hyperlink>
@@ -2566,7 +2566,7 @@
               <w:fldChar w:fldCharType="begin"/>
               <w:instrText xml:space="preserve"> PAGEREF _Toc225090856 \h </w:instrText>
               <w:fldChar w:fldCharType="separate"/>
-              <w:t>47</w:t>
+              <w:t>49</w:t>
               <w:fldChar w:fldCharType="end"/>
             </w:r>
           </w:hyperlink>
@@ -2603,7 +2603,7 @@
               <w:fldChar w:fldCharType="begin"/>
               <w:instrText xml:space="preserve"> PAGEREF _Toc225090857 \h </w:instrText>
               <w:fldChar w:fldCharType="separate"/>
-              <w:t>49</w:t>
+              <w:t>51</w:t>
               <w:fldChar w:fldCharType="end"/>
             </w:r>
           </w:hyperlink>
@@ -2640,7 +2640,7 @@
               <w:fldChar w:fldCharType="begin"/>
               <w:instrText xml:space="preserve"> PAGEREF _Toc225090858 \h </w:instrText>
               <w:fldChar w:fldCharType="separate"/>
-              <w:t>49</w:t>
+              <w:t>51</w:t>
               <w:fldChar w:fldCharType="end"/>
             </w:r>
           </w:hyperlink>
@@ -2677,7 +2677,7 @@
               <w:fldChar w:fldCharType="begin"/>
               <w:instrText xml:space="preserve"> PAGEREF _Toc225090859 \h </w:instrText>
               <w:fldChar w:fldCharType="separate"/>
-              <w:t>50</w:t>
+              <w:t>52</w:t>
               <w:fldChar w:fldCharType="end"/>
             </w:r>
           </w:hyperlink>
@@ -2714,7 +2714,7 @@
               <w:fldChar w:fldCharType="begin"/>
               <w:instrText xml:space="preserve"> PAGEREF _Toc225090860 \h </w:instrText>
               <w:fldChar w:fldCharType="separate"/>
-              <w:t>51</w:t>
+              <w:t>53</w:t>
               <w:fldChar w:fldCharType="end"/>
             </w:r>
           </w:hyperlink>
@@ -2751,7 +2751,7 @@
               <w:fldChar w:fldCharType="begin"/>
               <w:instrText xml:space="preserve"> PAGEREF _Toc225090861 \h </w:instrText>
               <w:fldChar w:fldCharType="separate"/>
-              <w:t>52</w:t>
+              <w:t>54</w:t>
               <w:fldChar w:fldCharType="end"/>
             </w:r>
           </w:hyperlink>
@@ -2788,7 +2788,7 @@
               <w:fldChar w:fldCharType="begin"/>
               <w:instrText xml:space="preserve"> PAGEREF _Toc225090862 \h </w:instrText>
               <w:fldChar w:fldCharType="separate"/>
-              <w:t>53</w:t>
+              <w:t>55</w:t>
               <w:fldChar w:fldCharType="end"/>
             </w:r>
           </w:hyperlink>
@@ -2825,7 +2825,7 @@
               <w:fldChar w:fldCharType="begin"/>
               <w:instrText xml:space="preserve"> PAGEREF _Toc225090863 \h </w:instrText>
               <w:fldChar w:fldCharType="separate"/>
-              <w:t>53</w:t>
+              <w:t>55</w:t>
               <w:fldChar w:fldCharType="end"/>
             </w:r>
           </w:hyperlink>
@@ -2862,7 +2862,7 @@
               <w:fldChar w:fldCharType="begin"/>
               <w:instrText xml:space="preserve"> PAGEREF _Toc225090864 \h </w:instrText>
               <w:fldChar w:fldCharType="separate"/>
-              <w:t>54</w:t>
+              <w:t>56</w:t>
               <w:fldChar w:fldCharType="end"/>
             </w:r>
           </w:hyperlink>
@@ -2899,7 +2899,7 @@
               <w:fldChar w:fldCharType="begin"/>
               <w:instrText xml:space="preserve"> PAGEREF _Toc225090865 \h </w:instrText>
               <w:fldChar w:fldCharType="separate"/>
-              <w:t>55</w:t>
+              <w:t>57</w:t>
               <w:fldChar w:fldCharType="end"/>
             </w:r>
           </w:hyperlink>
@@ -2936,7 +2936,7 @@
               <w:fldChar w:fldCharType="begin"/>
               <w:instrText xml:space="preserve"> PAGEREF _Toc225090866 \h </w:instrText>
               <w:fldChar w:fldCharType="separate"/>
-              <w:t>55</w:t>
+              <w:t>57</w:t>
               <w:fldChar w:fldCharType="end"/>
             </w:r>
           </w:hyperlink>
@@ -2973,7 +2973,7 @@
               <w:fldChar w:fldCharType="begin"/>
               <w:instrText xml:space="preserve"> PAGEREF _Toc225090867 \h </w:instrText>
               <w:fldChar w:fldCharType="separate"/>
-              <w:t>56</w:t>
+              <w:t>58</w:t>
               <w:fldChar w:fldCharType="end"/>
             </w:r>
           </w:hyperlink>
@@ -3010,7 +3010,7 @@
               <w:fldChar w:fldCharType="begin"/>
               <w:instrText xml:space="preserve"> PAGEREF _Toc225090868 \h </w:instrText>
               <w:fldChar w:fldCharType="separate"/>
-              <w:t>57</w:t>
+              <w:t>59</w:t>
               <w:fldChar w:fldCharType="end"/>
             </w:r>
           </w:hyperlink>
@@ -3047,7 +3047,7 @@
               <w:fldChar w:fldCharType="begin"/>
               <w:instrText xml:space="preserve"> PAGEREF _Toc225090869 \h </w:instrText>
               <w:fldChar w:fldCharType="separate"/>
-              <w:t>58</w:t>
+              <w:t>60</w:t>
               <w:fldChar w:fldCharType="end"/>
             </w:r>
           </w:hyperlink>
@@ -3084,7 +3084,7 @@
               <w:fldChar w:fldCharType="begin"/>
               <w:instrText xml:space="preserve"> PAGEREF _Toc225090870 \h </w:instrText>
               <w:fldChar w:fldCharType="separate"/>
-              <w:t>59</w:t>
+              <w:t>61</w:t>
               <w:fldChar w:fldCharType="end"/>
             </w:r>
           </w:hyperlink>
@@ -3121,7 +3121,7 @@
               <w:fldChar w:fldCharType="begin"/>
               <w:instrText xml:space="preserve"> PAGEREF _Toc225090871 \h </w:instrText>
               <w:fldChar w:fldCharType="separate"/>
-              <w:t>60</w:t>
+              <w:t>62</w:t>
               <w:fldChar w:fldCharType="end"/>
             </w:r>
           </w:hyperlink>
@@ -3158,7 +3158,7 @@
               <w:fldChar w:fldCharType="begin"/>
               <w:instrText xml:space="preserve"> PAGEREF _Toc225090872 \h </w:instrText>
               <w:fldChar w:fldCharType="separate"/>
-              <w:t>60</w:t>
+              <w:t>62</w:t>
               <w:fldChar w:fldCharType="end"/>
             </w:r>
           </w:hyperlink>
@@ -3195,7 +3195,7 @@
               <w:fldChar w:fldCharType="begin"/>
               <w:instrText xml:space="preserve"> PAGEREF _Toc225090873 \h </w:instrText>
               <w:fldChar w:fldCharType="separate"/>
-              <w:t>61</w:t>
+              <w:t>63</w:t>
               <w:fldChar w:fldCharType="end"/>
             </w:r>
           </w:hyperlink>
@@ -3232,7 +3232,7 @@
               <w:fldChar w:fldCharType="begin"/>
               <w:instrText xml:space="preserve"> PAGEREF _Toc225090874 \h </w:instrText>
               <w:fldChar w:fldCharType="separate"/>
-              <w:t>62</w:t>
+              <w:t>64</w:t>
               <w:fldChar w:fldCharType="end"/>
             </w:r>
           </w:hyperlink>
@@ -3269,7 +3269,7 @@
               <w:fldChar w:fldCharType="begin"/>
               <w:instrText xml:space="preserve"> PAGEREF _Toc225090875 \h </w:instrText>
               <w:fldChar w:fldCharType="separate"/>
-              <w:t>62</w:t>
+              <w:t>64</w:t>
               <w:fldChar w:fldCharType="end"/>
             </w:r>
           </w:hyperlink>
@@ -3306,7 +3306,7 @@
               <w:fldChar w:fldCharType="begin"/>
               <w:instrText xml:space="preserve"> PAGEREF _Toc225090876 \h </w:instrText>
               <w:fldChar w:fldCharType="separate"/>
-              <w:t>62</w:t>
+              <w:t>64</w:t>
               <w:fldChar w:fldCharType="end"/>
             </w:r>
           </w:hyperlink>
@@ -3343,7 +3343,7 @@
               <w:fldChar w:fldCharType="begin"/>
               <w:instrText xml:space="preserve"> PAGEREF _Toc225090877 \h </w:instrText>
               <w:fldChar w:fldCharType="separate"/>
-              <w:t>63</w:t>
+              <w:t>65</w:t>
               <w:fldChar w:fldCharType="end"/>
             </w:r>
           </w:hyperlink>
@@ -3380,7 +3380,7 @@
               <w:fldChar w:fldCharType="begin"/>
               <w:instrText xml:space="preserve"> PAGEREF _Toc225090878 \h </w:instrText>
               <w:fldChar w:fldCharType="separate"/>
-              <w:t>64</w:t>
+              <w:t>66</w:t>
               <w:fldChar w:fldCharType="end"/>
             </w:r>
           </w:hyperlink>
@@ -3417,7 +3417,7 @@
               <w:fldChar w:fldCharType="begin"/>
               <w:instrText xml:space="preserve"> PAGEREF _Toc225090879 \h </w:instrText>
               <w:fldChar w:fldCharType="separate"/>
-              <w:t>65</w:t>
+              <w:t>67</w:t>
               <w:fldChar w:fldCharType="end"/>
             </w:r>
           </w:hyperlink>
@@ -3454,7 +3454,7 @@
               <w:fldChar w:fldCharType="begin"/>
               <w:instrText xml:space="preserve"> PAGEREF _Toc225090880 \h </w:instrText>
               <w:fldChar w:fldCharType="separate"/>
-              <w:t>65</w:t>
+              <w:t>67</w:t>
               <w:fldChar w:fldCharType="end"/>
             </w:r>
           </w:hyperlink>
@@ -3491,7 +3491,7 @@
               <w:fldChar w:fldCharType="begin"/>
               <w:instrText xml:space="preserve"> PAGEREF _Toc225090881 \h </w:instrText>
               <w:fldChar w:fldCharType="separate"/>
-              <w:t>66</w:t>
+              <w:t>68</w:t>
               <w:fldChar w:fldCharType="end"/>
             </w:r>
           </w:hyperlink>
@@ -3528,7 +3528,7 @@
               <w:fldChar w:fldCharType="begin"/>
               <w:instrText xml:space="preserve"> PAGEREF _Toc225090882 \h </w:instrText>
               <w:fldChar w:fldCharType="separate"/>
-              <w:t>66</w:t>
+              <w:t>68</w:t>
               <w:fldChar w:fldCharType="end"/>
             </w:r>
           </w:hyperlink>
@@ -3565,7 +3565,7 @@
               <w:fldChar w:fldCharType="begin"/>
               <w:instrText xml:space="preserve"> PAGEREF _Toc225090883 \h </w:instrText>
               <w:fldChar w:fldCharType="separate"/>
-              <w:t>67</w:t>
+              <w:t>69</w:t>
               <w:fldChar w:fldCharType="end"/>
             </w:r>
           </w:hyperlink>
@@ -3602,7 +3602,7 @@
               <w:fldChar w:fldCharType="begin"/>
               <w:instrText xml:space="preserve"> PAGEREF _Toc225090884 \h </w:instrText>
               <w:fldChar w:fldCharType="separate"/>
-              <w:t>67</w:t>
+              <w:t>69</w:t>
               <w:fldChar w:fldCharType="end"/>
             </w:r>
           </w:hyperlink>
@@ -3639,7 +3639,7 @@
               <w:fldChar w:fldCharType="begin"/>
               <w:instrText xml:space="preserve"> PAGEREF _Toc225090885 \h </w:instrText>
               <w:fldChar w:fldCharType="separate"/>
-              <w:t>68</w:t>
+              <w:t>70</w:t>
               <w:fldChar w:fldCharType="end"/>
             </w:r>
           </w:hyperlink>
@@ -3676,7 +3676,7 @@
               <w:fldChar w:fldCharType="begin"/>
               <w:instrText xml:space="preserve"> PAGEREF _Toc225090886 \h </w:instrText>
               <w:fldChar w:fldCharType="separate"/>
-              <w:t>69</w:t>
+              <w:t>71</w:t>
               <w:fldChar w:fldCharType="end"/>
             </w:r>
           </w:hyperlink>
@@ -5171,6 +5171,7 @@
           </w:tcPr>
           <w:p>
             <w:r>
+              <w:lastRenderedPageBreak/>
               <w:t>mknod(path, major, minor)</w:t>
             </w:r>
           </w:p>
@@ -5653,7 +5654,6 @@
         <w:spacing w:before="80" w:after="80"/>
       </w:pPr>
       <w:r>
-        <w:lastRenderedPageBreak/>
         <w:t>A log</w:t>
       </w:r>
       <w:r>
@@ -5692,7 +5692,7 @@
         <w:t>child</w:t>
       </w:r>
       <w:r>
-        <w:t xml:space="preserve">) is an exact duplicate of the parent: it has the same memory contents, file descriptors, and environment variables. fork() returns the child’s PID to the parent and 0 to the child, so the two can distinguish themselves. exec() replaces the current process’s memory with a new program loaded from the filesystem. wait() blocks the calling process until one of its children exits and returns the child’s exit code.</w:t>
+        <w:t>) is an exact duplicate of the parent: it has the same memory contents, file descriptors, and environment variables. fork() returns the child’s PID to the parent and 0 to the child, so the two can distinguish themselves. exec() replaces the current process’s memory with a new program loaded from the filesystem. wait() blocks the calling process until one of its children exits and returns the child’s exit code.</w:t>
       </w:r>
     </w:p>
     <w:p>
@@ -5710,7 +5710,9 @@
         <w:t>OS</w:t>
       </w:r>
       <w:r>
-        <w:t xml:space="preserve"> also retains the simpler spawn() call as a convenience that combines fork, exec, and wait in a single step. spawn() is useful when a program simply needs to run another program and wait for it to finish, without any I/O redirection.</w:t>
+        <w:t xml:space="preserve"> also retains the simpler spawn() call as a convenience that combines fork, exec, and wait in a </w:t>
+        <w:lastRenderedPageBreak/>
+        <w:t>single step. spawn() is useful when a program simply needs to run another program and wait for it to finish, without any I/O redirection.</w:t>
       </w:r>
     </w:p>
     <w:p>
@@ -6021,7 +6023,6 @@
         <w:spacing w:before="80" w:after="80"/>
       </w:pPr>
       <w:r>
-        <w:lastRenderedPageBreak/>
         <w:t>The kernel passes argc in register a0 and argv in a1, following the RISC-V calling convention. After main() returns (its return value left in a0), _start issues the exit system call.</w:t>
       </w:r>
     </w:p>
@@ -6106,6 +6107,7 @@
               <w:br/>
               <w:t xml:space="preserve">   if (pid == 0) {</w:t>
               <w:br/>
+              <w:lastRenderedPageBreak/>
               <w:t xml:space="preserve">      /* Child process */</w:t>
               <w:br/>
               <w:t xml:space="preserve">      char *argv[2];</w:t>
@@ -6623,9 +6625,7 @@
         <w:t>buf</w:t>
       </w:r>
       <w:r>
-        <w:t xml:space="preserve">, and returns </w:t>
-        <w:lastRenderedPageBreak/>
-        <w:t>the number of bytes read. Each file descriptor that refers to a regular file has an associated offset. read reads data from the current offset and advances it.</w:t>
+        <w:t>, and returns the number of bytes read. Each file descriptor that refers to a regular file has an associated offset. read reads data from the current offset and advances it.</w:t>
       </w:r>
     </w:p>
     <w:p>
@@ -6671,6 +6671,7 @@
         <w:spacing w:before="80" w:after="80"/>
       </w:pPr>
       <w:r>
+        <w:lastRenderedPageBreak/>
         <w:t>The following code fragment (from the user library) writes a string to standard output (user/libc.c):</w:t>
       </w:r>
     </w:p>
@@ -7041,7 +7042,6 @@
         <w:rPr>
           <w:color w:val="2E86AB"/>
         </w:rPr>
-        <w:lastRenderedPageBreak/>
         <w:t xml:space="preserve">1.4  </w:t>
       </w:r>
       <w:r>
@@ -7110,7 +7110,9 @@
         <w:rPr>
           <w:color w:val="auto"/>
         </w:rPr>
-        <w:t>type are connected to the system, the minor number can be used to distinguish them, even though they all</w:t>
+        <w:t xml:space="preserve">type </w:t>
+        <w:lastRenderedPageBreak/>
+        <w:t>are connected to the system, the minor number can be used to distinguish them, even though they all</w:t>
       </w:r>
       <w:r>
         <w:t xml:space="preserve"> have the same major number.</w:t>
@@ -7969,6 +7971,7 @@
         <w:spacing w:before="80" w:after="80"/>
       </w:pPr>
       <w:r>
+        <w:lastRenderedPageBreak/>
         <w:t>The log</w:t>
       </w:r>
       <w:r>
@@ -8269,6 +8272,7 @@
     </w:p>
     <w:p>
       <w:r>
+        <w:lastRenderedPageBreak/>
         <w:br w:type="page"/>
       </w:r>
     </w:p>
@@ -10246,6 +10250,7 @@
           <w:bCs/>
           <w:color w:val="2E86AB"/>
         </w:rPr>
+        <w:lastRenderedPageBreak/>
         <w:t xml:space="preserve">2.  </w:t>
       </w:r>
       <w:r>
@@ -10273,7 +10278,6 @@
           <w:bCs/>
           <w:color w:val="4E98B8"/>
         </w:rPr>
-        <w:lastRenderedPageBreak/>
         <w:t>3</w:t>
       </w:r>
       <w:r>
@@ -12763,6 +12767,7 @@
           <w:sz w:val="18"/>
           <w:szCs w:val="18"/>
         </w:rPr>
+        <w:lastRenderedPageBreak/>
         <w:t>}</w:t>
       </w:r>
     </w:p>
@@ -12779,7 +12784,6 @@
         <w:spacing w:before="80" w:after="80"/>
       </w:pPr>
       <w:r>
-        <w:lastRenderedPageBreak/>
         <w:t>Two crucial things happen after every system call. First, the return value is placed in tf-&gt;a0, which becomes register a0 when the user program resumes — exactly where the C calling convention expects a function's return value. Second, mepc is advanced by 4 bytes (one instruction) to skip past the ecall instruction. Without this, the program would execute ecall again in an infinite loop.</w:t>
       </w:r>
     </w:p>
@@ -13285,6 +13289,7 @@
           <w:sz w:val="18"/>
           <w:szCs w:val="18"/>
         </w:rPr>
+        <w:lastRenderedPageBreak/>
         <w:t xml:space="preserve">    ecall               # Trap into kernel</w:t>
       </w:r>
     </w:p>
@@ -13324,7 +13329,6 @@
         <w:spacing w:before="80" w:after="80"/>
       </w:pPr>
       <w:r>
-        <w:lastRenderedPageBreak/>
         <w:t>The RISC-V calling convention places the first argument in a0, the second in a1, and so on. The system call stubs exploit this: the C caller already has the arguments in the right registers (a0-a5), so the stub only needs to load the system call number into a7 and execute ecall. No argument copying is needed. This elegant alignment between the C calling convention and the system call ABI is by design.</w:t>
       </w:r>
     </w:p>
@@ -13571,6 +13575,7 @@
           <w:bCs/>
           <w:color w:val="2E86AB"/>
         </w:rPr>
+        <w:lastRenderedPageBreak/>
         <w:t xml:space="preserve">1.  </w:t>
       </w:r>
       <w:r>
@@ -13622,7 +13627,6 @@
           <w:bCs/>
           <w:color w:val="2E86AB"/>
         </w:rPr>
-        <w:lastRenderedPageBreak/>
         <w:t xml:space="preserve">4.  </w:t>
       </w:r>
       <w:r>
@@ -18816,7 +18820,7 @@
         <w:t xml:space="preserve">7.1  </w:t>
       </w:r>
       <w:r>
-        <w:t>File manipulation: rm, cp, mv, ln</w:t>
+        <w:t>File manipulation: ls, rm, cp, mv, ln</w:t>
       </w:r>
       <w:bookmarkEnd w:id="83"/>
       <w:bookmarkEnd w:id="84"/>
@@ -18830,296 +18834,62 @@
           <w:b/>
           <w:bCs/>
         </w:rPr>
-        <w:t>rm</w:t>
-      </w:r>
-      <w:r>
-        <w:t xml:space="preserve"> (user/rm.c) removes a file by calling unlink(path). The unlink system call removes the directory entry for the file and decrements its inode link count. If the link count reaches zero, the inode and its data blocks are freed. The implementation is simple:</w:t>
-      </w:r>
-    </w:p>
-    <w:p>
-      <w:pPr>
-        <w:pStyle w:val="HTMLPreformatted"/>
-        <w:pBdr>
-          <w:top w:val="single" w:sz="6" w:space="8" w:color="DDDDDD"/>
-          <w:left w:val="single" w:sz="6" w:space="8" w:color="DDDDDD"/>
-          <w:bottom w:val="single" w:sz="6" w:space="8" w:color="DDDDDD"/>
-          <w:right w:val="single" w:sz="6" w:space="8" w:color="DDDDDD"/>
-        </w:pBdr>
-        <w:shd w:val="clear" w:color="auto" w:fill="F5F5F5"/>
-        <w:spacing w:before="80"/>
-        <w:rPr>
-          <w:color w:val="000000"/>
-          <w:sz w:val="18"/>
-          <w:szCs w:val="18"/>
-        </w:rPr>
-      </w:pPr>
-      <w:r>
-        <w:rPr>
-          <w:color w:val="000000"/>
-          <w:sz w:val="18"/>
-          <w:szCs w:val="18"/>
-        </w:rPr>
-        <w:t>int main(int argc, char *argv[]) {</w:t>
-      </w:r>
-    </w:p>
-    <w:p>
-      <w:pPr>
-        <w:pStyle w:val="HTMLPreformatted"/>
-        <w:pBdr>
-          <w:top w:val="single" w:sz="6" w:space="8" w:color="DDDDDD"/>
-          <w:left w:val="single" w:sz="6" w:space="8" w:color="DDDDDD"/>
-          <w:bottom w:val="single" w:sz="6" w:space="8" w:color="DDDDDD"/>
-          <w:right w:val="single" w:sz="6" w:space="8" w:color="DDDDDD"/>
-        </w:pBdr>
-        <w:shd w:val="clear" w:color="auto" w:fill="F5F5F5"/>
-        <w:spacing w:before="80"/>
-        <w:rPr>
-          <w:color w:val="000000"/>
-          <w:sz w:val="18"/>
-          <w:szCs w:val="18"/>
-        </w:rPr>
-      </w:pPr>
-      <w:r>
-        <w:rPr>
-          <w:color w:val="000000"/>
-          <w:sz w:val="18"/>
-          <w:szCs w:val="18"/>
-        </w:rPr>
-        <w:t xml:space="preserve">    if (argc &lt; 2) {</w:t>
-      </w:r>
-    </w:p>
-    <w:p>
-      <w:pPr>
-        <w:pStyle w:val="HTMLPreformatted"/>
-        <w:pBdr>
-          <w:top w:val="single" w:sz="6" w:space="8" w:color="DDDDDD"/>
-          <w:left w:val="single" w:sz="6" w:space="8" w:color="DDDDDD"/>
-          <w:bottom w:val="single" w:sz="6" w:space="8" w:color="DDDDDD"/>
-          <w:right w:val="single" w:sz="6" w:space="8" w:color="DDDDDD"/>
-        </w:pBdr>
-        <w:shd w:val="clear" w:color="auto" w:fill="F5F5F5"/>
-        <w:spacing w:before="80"/>
-        <w:rPr>
-          <w:color w:val="000000"/>
-          <w:sz w:val="18"/>
-          <w:szCs w:val="18"/>
-        </w:rPr>
-      </w:pPr>
-      <w:r>
-        <w:rPr>
-          <w:color w:val="000000"/>
-          <w:sz w:val="18"/>
-          <w:szCs w:val="18"/>
-        </w:rPr>
-        <w:t xml:space="preserve">        puts("usage: rm &lt;file&gt; [file2 ...]");</w:t>
-      </w:r>
-    </w:p>
-    <w:p>
-      <w:pPr>
-        <w:pStyle w:val="HTMLPreformatted"/>
-        <w:pBdr>
-          <w:top w:val="single" w:sz="6" w:space="8" w:color="DDDDDD"/>
-          <w:left w:val="single" w:sz="6" w:space="8" w:color="DDDDDD"/>
-          <w:bottom w:val="single" w:sz="6" w:space="8" w:color="DDDDDD"/>
-          <w:right w:val="single" w:sz="6" w:space="8" w:color="DDDDDD"/>
-        </w:pBdr>
-        <w:shd w:val="clear" w:color="auto" w:fill="F5F5F5"/>
-        <w:spacing w:before="80"/>
-        <w:rPr>
-          <w:color w:val="000000"/>
-          <w:sz w:val="18"/>
-          <w:szCs w:val="18"/>
-        </w:rPr>
-      </w:pPr>
-      <w:r>
-        <w:rPr>
-          <w:color w:val="000000"/>
-          <w:sz w:val="18"/>
-          <w:szCs w:val="18"/>
-        </w:rPr>
-        <w:t xml:space="preserve">        return 1;</w:t>
-      </w:r>
-    </w:p>
-    <w:p>
-      <w:pPr>
-        <w:pStyle w:val="HTMLPreformatted"/>
-        <w:pBdr>
-          <w:top w:val="single" w:sz="6" w:space="8" w:color="DDDDDD"/>
-          <w:left w:val="single" w:sz="6" w:space="8" w:color="DDDDDD"/>
-          <w:bottom w:val="single" w:sz="6" w:space="8" w:color="DDDDDD"/>
-          <w:right w:val="single" w:sz="6" w:space="8" w:color="DDDDDD"/>
-        </w:pBdr>
-        <w:shd w:val="clear" w:color="auto" w:fill="F5F5F5"/>
-        <w:spacing w:before="80"/>
-        <w:rPr>
-          <w:color w:val="000000"/>
-          <w:sz w:val="18"/>
-          <w:szCs w:val="18"/>
-        </w:rPr>
-      </w:pPr>
-      <w:r>
-        <w:rPr>
-          <w:color w:val="000000"/>
-          <w:sz w:val="18"/>
-          <w:szCs w:val="18"/>
-        </w:rPr>
-        <w:t xml:space="preserve">    }</w:t>
-      </w:r>
-    </w:p>
-    <w:p>
-      <w:pPr>
-        <w:pStyle w:val="HTMLPreformatted"/>
-        <w:pBdr>
-          <w:top w:val="single" w:sz="6" w:space="8" w:color="DDDDDD"/>
-          <w:left w:val="single" w:sz="6" w:space="8" w:color="DDDDDD"/>
-          <w:bottom w:val="single" w:sz="6" w:space="8" w:color="DDDDDD"/>
-          <w:right w:val="single" w:sz="6" w:space="8" w:color="DDDDDD"/>
-        </w:pBdr>
-        <w:shd w:val="clear" w:color="auto" w:fill="F5F5F5"/>
-        <w:spacing w:before="80"/>
-        <w:rPr>
-          <w:color w:val="000000"/>
-          <w:sz w:val="18"/>
-          <w:szCs w:val="18"/>
-        </w:rPr>
-      </w:pPr>
-      <w:r>
-        <w:rPr>
-          <w:color w:val="000000"/>
-          <w:sz w:val="18"/>
-          <w:szCs w:val="18"/>
-        </w:rPr>
-        <w:t xml:space="preserve">    for (int i = 1; i &lt; argc; i++) {</w:t>
-      </w:r>
-    </w:p>
-    <w:p>
-      <w:pPr>
-        <w:pStyle w:val="HTMLPreformatted"/>
-        <w:pBdr>
-          <w:top w:val="single" w:sz="6" w:space="8" w:color="DDDDDD"/>
-          <w:left w:val="single" w:sz="6" w:space="8" w:color="DDDDDD"/>
-          <w:bottom w:val="single" w:sz="6" w:space="8" w:color="DDDDDD"/>
-          <w:right w:val="single" w:sz="6" w:space="8" w:color="DDDDDD"/>
-        </w:pBdr>
-        <w:shd w:val="clear" w:color="auto" w:fill="F5F5F5"/>
-        <w:spacing w:before="80"/>
-        <w:rPr>
-          <w:color w:val="000000"/>
-          <w:sz w:val="18"/>
-          <w:szCs w:val="18"/>
-        </w:rPr>
-      </w:pPr>
-      <w:r>
-        <w:rPr>
-          <w:color w:val="000000"/>
-          <w:sz w:val="18"/>
-          <w:szCs w:val="18"/>
-        </w:rPr>
-        <w:t xml:space="preserve">        if (unlink(argv[i]) &lt; 0)</w:t>
-      </w:r>
-    </w:p>
-    <w:p>
-      <w:pPr>
-        <w:pStyle w:val="HTMLPreformatted"/>
-        <w:pBdr>
-          <w:top w:val="single" w:sz="6" w:space="8" w:color="DDDDDD"/>
-          <w:left w:val="single" w:sz="6" w:space="8" w:color="DDDDDD"/>
-          <w:bottom w:val="single" w:sz="6" w:space="8" w:color="DDDDDD"/>
-          <w:right w:val="single" w:sz="6" w:space="8" w:color="DDDDDD"/>
-        </w:pBdr>
-        <w:shd w:val="clear" w:color="auto" w:fill="F5F5F5"/>
-        <w:spacing w:before="80"/>
-        <w:rPr>
-          <w:color w:val="000000"/>
-          <w:sz w:val="18"/>
-          <w:szCs w:val="18"/>
-        </w:rPr>
-      </w:pPr>
-      <w:r>
-        <w:rPr>
-          <w:color w:val="000000"/>
-          <w:sz w:val="18"/>
-          <w:szCs w:val="18"/>
-        </w:rPr>
-        <w:t xml:space="preserve">            printf("rm: %s: failed\n", argv[i]);</w:t>
-      </w:r>
-    </w:p>
-    <w:p>
-      <w:pPr>
-        <w:pStyle w:val="HTMLPreformatted"/>
-        <w:pBdr>
-          <w:top w:val="single" w:sz="6" w:space="8" w:color="DDDDDD"/>
-          <w:left w:val="single" w:sz="6" w:space="8" w:color="DDDDDD"/>
-          <w:bottom w:val="single" w:sz="6" w:space="8" w:color="DDDDDD"/>
-          <w:right w:val="single" w:sz="6" w:space="8" w:color="DDDDDD"/>
-        </w:pBdr>
-        <w:shd w:val="clear" w:color="auto" w:fill="F5F5F5"/>
-        <w:spacing w:before="80"/>
-        <w:rPr>
-          <w:color w:val="000000"/>
-          <w:sz w:val="18"/>
-          <w:szCs w:val="18"/>
-        </w:rPr>
-      </w:pPr>
-      <w:r>
-        <w:rPr>
-          <w:color w:val="000000"/>
-          <w:sz w:val="18"/>
-          <w:szCs w:val="18"/>
-        </w:rPr>
-        <w:t xml:space="preserve">    }</w:t>
-      </w:r>
-    </w:p>
-    <w:p>
-      <w:pPr>
-        <w:pStyle w:val="HTMLPreformatted"/>
-        <w:pBdr>
-          <w:top w:val="single" w:sz="6" w:space="8" w:color="DDDDDD"/>
-          <w:left w:val="single" w:sz="6" w:space="8" w:color="DDDDDD"/>
-          <w:bottom w:val="single" w:sz="6" w:space="8" w:color="DDDDDD"/>
-          <w:right w:val="single" w:sz="6" w:space="8" w:color="DDDDDD"/>
-        </w:pBdr>
-        <w:shd w:val="clear" w:color="auto" w:fill="F5F5F5"/>
-        <w:spacing w:before="80"/>
-        <w:rPr>
-          <w:color w:val="000000"/>
-          <w:sz w:val="18"/>
-          <w:szCs w:val="18"/>
-        </w:rPr>
-      </w:pPr>
-      <w:r>
-        <w:rPr>
-          <w:color w:val="000000"/>
-          <w:sz w:val="18"/>
-          <w:szCs w:val="18"/>
-        </w:rPr>
-        <w:t xml:space="preserve">    return 0;</w:t>
-      </w:r>
-    </w:p>
-    <w:p>
-      <w:pPr>
-        <w:pStyle w:val="HTMLPreformatted"/>
-        <w:pBdr>
-          <w:top w:val="single" w:sz="6" w:space="8" w:color="DDDDDD"/>
-          <w:left w:val="single" w:sz="6" w:space="8" w:color="DDDDDD"/>
-          <w:bottom w:val="single" w:sz="6" w:space="8" w:color="DDDDDD"/>
-          <w:right w:val="single" w:sz="6" w:space="8" w:color="DDDDDD"/>
-        </w:pBdr>
-        <w:shd w:val="clear" w:color="auto" w:fill="F5F5F5"/>
-        <w:spacing w:before="80"/>
-        <w:rPr>
-          <w:color w:val="000000"/>
-          <w:sz w:val="18"/>
-          <w:szCs w:val="18"/>
-        </w:rPr>
-      </w:pPr>
-      <w:r>
-        <w:rPr>
-          <w:color w:val="000000"/>
-          <w:sz w:val="18"/>
-          <w:szCs w:val="18"/>
-        </w:rPr>
-        <w:t>}</w:t>
+        <w:t>ls</w:t>
+      </w:r>
+      <w:r>
+        <w:t xml:space="preserve"> (user/ls.c) lists directory contents. It calls readdir() to get directory entries, then stat() on each entry to display the file type (d for directory, c for character device, - for regular file), size in bytes, and filename. Example output:</w:t>
+      </w:r>
+    </w:p>
+    <w:p>
+      <w:pPr>
+        <w:pStyle w:val="HTMLPreformatted"/>
+        <w:pBdr>
+          <w:top w:val="single" w:sz="6" w:space="8" w:color="DDDDDD"/>
+          <w:left w:val="single" w:sz="6" w:space="8" w:color="DDDDDD"/>
+          <w:bottom w:val="single" w:sz="6" w:space="8" w:color="DDDDDD"/>
+          <w:right w:val="single" w:sz="6" w:space="8" w:color="DDDDDD"/>
+        </w:pBdr>
+        <w:shd w:val="clear" w:color="auto" w:fill="F5F5F5"/>
+        <w:spacing w:before="80"/>
+        <w:rPr>
+          <w:color w:val="000000"/>
+          <w:sz w:val="18"/>
+          <w:szCs w:val="18"/>
+        </w:rPr>
+      </w:pPr>
+      <w:r>
+        <w:rPr>
+          <w:color w:val="000000"/>
+          <w:sz w:val="18"/>
+          <w:szCs w:val="18"/>
+        </w:rPr>
+        <w:t>d   64 bin</w:t>
+      </w:r>
+    </w:p>
+    <w:p>
+      <w:pPr>
+        <w:pStyle w:val="HTMLPreformatted"/>
+        <w:pBdr>
+          <w:top w:val="single" w:sz="6" w:space="8" w:color="DDDDDD"/>
+          <w:left w:val="single" w:sz="6" w:space="8" w:color="DDDDDD"/>
+          <w:bottom w:val="single" w:sz="6" w:space="8" w:color="DDDDDD"/>
+          <w:right w:val="single" w:sz="6" w:space="8" w:color="DDDDDD"/>
+        </w:pBdr>
+        <w:shd w:val="clear" w:color="auto" w:fill="F5F5F5"/>
+        <w:spacing w:before="80"/>
+        <w:rPr>
+          <w:color w:val="000000"/>
+          <w:sz w:val="18"/>
+          <w:szCs w:val="18"/>
+        </w:rPr>
+      </w:pPr>
+      <w:r>
+        <w:rPr>
+          <w:color w:val="000000"/>
+          <w:sz w:val="18"/>
+          <w:szCs w:val="18"/>
+        </w:rPr>
+        <w:t>-  512 kernel</w:t>
       </w:r>
     </w:p>
     <w:p>
@@ -19131,10 +18901,296 @@
           <w:b/>
           <w:bCs/>
         </w:rPr>
-        <w:t>cp</w:t>
-      </w:r>
-      <w:r>
-        <w:t xml:space="preserve"> (user/cp.c) copies a file by reading from the source and writing to the destination in 512-byte chunks. It uses open(), read(), write(), and close() in a straightforward loop. The destination is created with O_WRONLY | O_CREAT | O_TRUNC, which creates the file if it doesn’t exist and truncates it if it does.</w:t>
+        <w:t>rm</w:t>
+      </w:r>
+      <w:r>
+        <w:t xml:space="preserve"> (user/rm.c) removes a file by calling unlink(path). The unlink system call removes the directory entry for the file and decrements its inode link count. If the link count reaches zero, the inode and its data blocks are freed. The implementation is simple:</w:t>
+      </w:r>
+    </w:p>
+    <w:p>
+      <w:pPr>
+        <w:pStyle w:val="HTMLPreformatted"/>
+        <w:pBdr>
+          <w:top w:val="single" w:sz="6" w:space="8" w:color="DDDDDD"/>
+          <w:left w:val="single" w:sz="6" w:space="8" w:color="DDDDDD"/>
+          <w:bottom w:val="single" w:sz="6" w:space="8" w:color="DDDDDD"/>
+          <w:right w:val="single" w:sz="6" w:space="8" w:color="DDDDDD"/>
+        </w:pBdr>
+        <w:shd w:val="clear" w:color="auto" w:fill="F5F5F5"/>
+        <w:spacing w:before="80"/>
+        <w:rPr>
+          <w:color w:val="000000"/>
+          <w:sz w:val="18"/>
+          <w:szCs w:val="18"/>
+        </w:rPr>
+      </w:pPr>
+      <w:r>
+        <w:rPr>
+          <w:color w:val="000000"/>
+          <w:sz w:val="18"/>
+          <w:szCs w:val="18"/>
+        </w:rPr>
+        <w:t>int main(int argc, char *argv[]) {</w:t>
+      </w:r>
+    </w:p>
+    <w:p>
+      <w:pPr>
+        <w:pStyle w:val="HTMLPreformatted"/>
+        <w:pBdr>
+          <w:top w:val="single" w:sz="6" w:space="8" w:color="DDDDDD"/>
+          <w:left w:val="single" w:sz="6" w:space="8" w:color="DDDDDD"/>
+          <w:bottom w:val="single" w:sz="6" w:space="8" w:color="DDDDDD"/>
+          <w:right w:val="single" w:sz="6" w:space="8" w:color="DDDDDD"/>
+        </w:pBdr>
+        <w:shd w:val="clear" w:color="auto" w:fill="F5F5F5"/>
+        <w:spacing w:before="80"/>
+        <w:rPr>
+          <w:color w:val="000000"/>
+          <w:sz w:val="18"/>
+          <w:szCs w:val="18"/>
+        </w:rPr>
+      </w:pPr>
+      <w:r>
+        <w:rPr>
+          <w:color w:val="000000"/>
+          <w:sz w:val="18"/>
+          <w:szCs w:val="18"/>
+        </w:rPr>
+        <w:t xml:space="preserve">    if (argc &lt; 2) {</w:t>
+      </w:r>
+    </w:p>
+    <w:p>
+      <w:pPr>
+        <w:pStyle w:val="HTMLPreformatted"/>
+        <w:pBdr>
+          <w:top w:val="single" w:sz="6" w:space="8" w:color="DDDDDD"/>
+          <w:left w:val="single" w:sz="6" w:space="8" w:color="DDDDDD"/>
+          <w:bottom w:val="single" w:sz="6" w:space="8" w:color="DDDDDD"/>
+          <w:right w:val="single" w:sz="6" w:space="8" w:color="DDDDDD"/>
+        </w:pBdr>
+        <w:shd w:val="clear" w:color="auto" w:fill="F5F5F5"/>
+        <w:spacing w:before="80"/>
+        <w:rPr>
+          <w:color w:val="000000"/>
+          <w:sz w:val="18"/>
+          <w:szCs w:val="18"/>
+        </w:rPr>
+      </w:pPr>
+      <w:r>
+        <w:rPr>
+          <w:color w:val="000000"/>
+          <w:sz w:val="18"/>
+          <w:szCs w:val="18"/>
+        </w:rPr>
+        <w:t xml:space="preserve">        puts("usage: rm &lt;file&gt; [file2 ...]");</w:t>
+      </w:r>
+    </w:p>
+    <w:p>
+      <w:pPr>
+        <w:pStyle w:val="HTMLPreformatted"/>
+        <w:pBdr>
+          <w:top w:val="single" w:sz="6" w:space="8" w:color="DDDDDD"/>
+          <w:left w:val="single" w:sz="6" w:space="8" w:color="DDDDDD"/>
+          <w:bottom w:val="single" w:sz="6" w:space="8" w:color="DDDDDD"/>
+          <w:right w:val="single" w:sz="6" w:space="8" w:color="DDDDDD"/>
+        </w:pBdr>
+        <w:shd w:val="clear" w:color="auto" w:fill="F5F5F5"/>
+        <w:spacing w:before="80"/>
+        <w:rPr>
+          <w:color w:val="000000"/>
+          <w:sz w:val="18"/>
+          <w:szCs w:val="18"/>
+        </w:rPr>
+      </w:pPr>
+      <w:r>
+        <w:rPr>
+          <w:color w:val="000000"/>
+          <w:sz w:val="18"/>
+          <w:szCs w:val="18"/>
+        </w:rPr>
+        <w:t xml:space="preserve">        return 1;</w:t>
+      </w:r>
+    </w:p>
+    <w:p>
+      <w:pPr>
+        <w:pStyle w:val="HTMLPreformatted"/>
+        <w:pBdr>
+          <w:top w:val="single" w:sz="6" w:space="8" w:color="DDDDDD"/>
+          <w:left w:val="single" w:sz="6" w:space="8" w:color="DDDDDD"/>
+          <w:bottom w:val="single" w:sz="6" w:space="8" w:color="DDDDDD"/>
+          <w:right w:val="single" w:sz="6" w:space="8" w:color="DDDDDD"/>
+        </w:pBdr>
+        <w:shd w:val="clear" w:color="auto" w:fill="F5F5F5"/>
+        <w:spacing w:before="80"/>
+        <w:rPr>
+          <w:color w:val="000000"/>
+          <w:sz w:val="18"/>
+          <w:szCs w:val="18"/>
+        </w:rPr>
+      </w:pPr>
+      <w:r>
+        <w:rPr>
+          <w:color w:val="000000"/>
+          <w:sz w:val="18"/>
+          <w:szCs w:val="18"/>
+        </w:rPr>
+        <w:t xml:space="preserve">    }</w:t>
+      </w:r>
+    </w:p>
+    <w:p>
+      <w:pPr>
+        <w:pStyle w:val="HTMLPreformatted"/>
+        <w:pBdr>
+          <w:top w:val="single" w:sz="6" w:space="8" w:color="DDDDDD"/>
+          <w:left w:val="single" w:sz="6" w:space="8" w:color="DDDDDD"/>
+          <w:bottom w:val="single" w:sz="6" w:space="8" w:color="DDDDDD"/>
+          <w:right w:val="single" w:sz="6" w:space="8" w:color="DDDDDD"/>
+        </w:pBdr>
+        <w:shd w:val="clear" w:color="auto" w:fill="F5F5F5"/>
+        <w:spacing w:before="80"/>
+        <w:rPr>
+          <w:color w:val="000000"/>
+          <w:sz w:val="18"/>
+          <w:szCs w:val="18"/>
+        </w:rPr>
+      </w:pPr>
+      <w:r>
+        <w:rPr>
+          <w:color w:val="000000"/>
+          <w:sz w:val="18"/>
+          <w:szCs w:val="18"/>
+        </w:rPr>
+        <w:t xml:space="preserve">    for (int i = 1; i &lt; argc; i++) {</w:t>
+      </w:r>
+    </w:p>
+    <w:p>
+      <w:pPr>
+        <w:pStyle w:val="HTMLPreformatted"/>
+        <w:pBdr>
+          <w:top w:val="single" w:sz="6" w:space="8" w:color="DDDDDD"/>
+          <w:left w:val="single" w:sz="6" w:space="8" w:color="DDDDDD"/>
+          <w:bottom w:val="single" w:sz="6" w:space="8" w:color="DDDDDD"/>
+          <w:right w:val="single" w:sz="6" w:space="8" w:color="DDDDDD"/>
+        </w:pBdr>
+        <w:shd w:val="clear" w:color="auto" w:fill="F5F5F5"/>
+        <w:spacing w:before="80"/>
+        <w:rPr>
+          <w:color w:val="000000"/>
+          <w:sz w:val="18"/>
+          <w:szCs w:val="18"/>
+        </w:rPr>
+      </w:pPr>
+      <w:r>
+        <w:rPr>
+          <w:color w:val="000000"/>
+          <w:sz w:val="18"/>
+          <w:szCs w:val="18"/>
+        </w:rPr>
+        <w:t xml:space="preserve">        if (unlink(argv[i]) &lt; 0)</w:t>
+      </w:r>
+    </w:p>
+    <w:p>
+      <w:pPr>
+        <w:pStyle w:val="HTMLPreformatted"/>
+        <w:pBdr>
+          <w:top w:val="single" w:sz="6" w:space="8" w:color="DDDDDD"/>
+          <w:left w:val="single" w:sz="6" w:space="8" w:color="DDDDDD"/>
+          <w:bottom w:val="single" w:sz="6" w:space="8" w:color="DDDDDD"/>
+          <w:right w:val="single" w:sz="6" w:space="8" w:color="DDDDDD"/>
+        </w:pBdr>
+        <w:shd w:val="clear" w:color="auto" w:fill="F5F5F5"/>
+        <w:spacing w:before="80"/>
+        <w:rPr>
+          <w:color w:val="000000"/>
+          <w:sz w:val="18"/>
+          <w:szCs w:val="18"/>
+        </w:rPr>
+      </w:pPr>
+      <w:r>
+        <w:rPr>
+          <w:color w:val="000000"/>
+          <w:sz w:val="18"/>
+          <w:szCs w:val="18"/>
+        </w:rPr>
+        <w:t xml:space="preserve">            printf("rm: %s: failed\n", argv[i]);</w:t>
+      </w:r>
+    </w:p>
+    <w:p>
+      <w:pPr>
+        <w:pStyle w:val="HTMLPreformatted"/>
+        <w:pBdr>
+          <w:top w:val="single" w:sz="6" w:space="8" w:color="DDDDDD"/>
+          <w:left w:val="single" w:sz="6" w:space="8" w:color="DDDDDD"/>
+          <w:bottom w:val="single" w:sz="6" w:space="8" w:color="DDDDDD"/>
+          <w:right w:val="single" w:sz="6" w:space="8" w:color="DDDDDD"/>
+        </w:pBdr>
+        <w:shd w:val="clear" w:color="auto" w:fill="F5F5F5"/>
+        <w:spacing w:before="80"/>
+        <w:rPr>
+          <w:color w:val="000000"/>
+          <w:sz w:val="18"/>
+          <w:szCs w:val="18"/>
+        </w:rPr>
+      </w:pPr>
+      <w:r>
+        <w:rPr>
+          <w:color w:val="000000"/>
+          <w:sz w:val="18"/>
+          <w:szCs w:val="18"/>
+        </w:rPr>
+        <w:t xml:space="preserve">    }</w:t>
+      </w:r>
+    </w:p>
+    <w:p>
+      <w:pPr>
+        <w:pStyle w:val="HTMLPreformatted"/>
+        <w:pBdr>
+          <w:top w:val="single" w:sz="6" w:space="8" w:color="DDDDDD"/>
+          <w:left w:val="single" w:sz="6" w:space="8" w:color="DDDDDD"/>
+          <w:bottom w:val="single" w:sz="6" w:space="8" w:color="DDDDDD"/>
+          <w:right w:val="single" w:sz="6" w:space="8" w:color="DDDDDD"/>
+        </w:pBdr>
+        <w:shd w:val="clear" w:color="auto" w:fill="F5F5F5"/>
+        <w:spacing w:before="80"/>
+        <w:rPr>
+          <w:color w:val="000000"/>
+          <w:sz w:val="18"/>
+          <w:szCs w:val="18"/>
+        </w:rPr>
+      </w:pPr>
+      <w:r>
+        <w:rPr>
+          <w:color w:val="000000"/>
+          <w:sz w:val="18"/>
+          <w:szCs w:val="18"/>
+        </w:rPr>
+        <w:t xml:space="preserve">    return 0;</w:t>
+      </w:r>
+    </w:p>
+    <w:p>
+      <w:pPr>
+        <w:pStyle w:val="HTMLPreformatted"/>
+        <w:pBdr>
+          <w:top w:val="single" w:sz="6" w:space="8" w:color="DDDDDD"/>
+          <w:left w:val="single" w:sz="6" w:space="8" w:color="DDDDDD"/>
+          <w:bottom w:val="single" w:sz="6" w:space="8" w:color="DDDDDD"/>
+          <w:right w:val="single" w:sz="6" w:space="8" w:color="DDDDDD"/>
+        </w:pBdr>
+        <w:shd w:val="clear" w:color="auto" w:fill="F5F5F5"/>
+        <w:spacing w:before="80"/>
+        <w:rPr>
+          <w:color w:val="000000"/>
+          <w:sz w:val="18"/>
+          <w:szCs w:val="18"/>
+        </w:rPr>
+      </w:pPr>
+      <w:r>
+        <w:rPr>
+          <w:color w:val="000000"/>
+          <w:sz w:val="18"/>
+          <w:szCs w:val="18"/>
+        </w:rPr>
+        <w:t>}</w:t>
       </w:r>
     </w:p>
     <w:p>
@@ -19146,10 +19202,10 @@
           <w:b/>
           <w:bCs/>
         </w:rPr>
-        <w:t>mv</w:t>
-      </w:r>
-      <w:r>
-        <w:t xml:space="preserve"> (user/mv.c) moves or renames a file using the rename() system call, which atomically changes the directory entry without copying any data. This is efficient even for large files because only the directory is modified.</w:t>
+        <w:t>cp</w:t>
+      </w:r>
+      <w:r>
+        <w:t xml:space="preserve"> (user/cp.c) copies a file by reading from the source and writing to the destination in 512-byte chunks. It uses open(), read(), write(), and close() in a straightforward loop. The destination is created with O_WRONLY | O_CREAT | O_TRUNC, which creates the file if it doesn’t exist and truncates it if it does.</w:t>
       </w:r>
     </w:p>
     <w:p>
@@ -19161,6 +19217,21 @@
           <w:b/>
           <w:bCs/>
         </w:rPr>
+        <w:t>mv</w:t>
+      </w:r>
+      <w:r>
+        <w:t xml:space="preserve"> (user/mv.c) moves or renames a file using the rename() system call, which atomically changes the directory entry without copying any data. This is efficient even for large files because only the directory is modified.</w:t>
+      </w:r>
+    </w:p>
+    <w:p>
+      <w:pPr>
+        <w:spacing w:before="80" w:after="80"/>
+      </w:pPr>
+      <w:r>
+        <w:rPr>
+          <w:b/>
+          <w:bCs/>
+        </w:rPr>
         <w:t>ln</w:t>
       </w:r>
       <w:r>
@@ -19199,85 +19270,85 @@
         <w:t>ps</w:t>
       </w:r>
       <w:r>
-        <w:t xml:space="preserve"> (user/ps.c) lists active processes using the ps() system call, which fills an array of proc_info structures. Each entry contains the process’s PID, state, and parent slot. The ps utility translates numeric states to human-readable names:</w:t>
-      </w:r>
-    </w:p>
-    <w:p>
-      <w:pPr>
-        <w:pStyle w:val="HTMLPreformatted"/>
-        <w:pBdr>
-          <w:top w:val="single" w:sz="6" w:space="8" w:color="DDDDDD"/>
-          <w:left w:val="single" w:sz="6" w:space="8" w:color="DDDDDD"/>
-          <w:bottom w:val="single" w:sz="6" w:space="8" w:color="DDDDDD"/>
-          <w:right w:val="single" w:sz="6" w:space="8" w:color="DDDDDD"/>
-        </w:pBdr>
-        <w:shd w:val="clear" w:color="auto" w:fill="F5F5F5"/>
-        <w:spacing w:before="80"/>
-        <w:rPr>
-          <w:color w:val="000000"/>
-          <w:sz w:val="18"/>
-          <w:szCs w:val="18"/>
-        </w:rPr>
-      </w:pPr>
-      <w:r>
-        <w:rPr>
-          <w:color w:val="000000"/>
-          <w:sz w:val="18"/>
-          <w:szCs w:val="18"/>
-        </w:rPr>
-        <w:t>static const char *state_names[] = {</w:t>
-      </w:r>
-    </w:p>
-    <w:p>
-      <w:pPr>
-        <w:pStyle w:val="HTMLPreformatted"/>
-        <w:pBdr>
-          <w:top w:val="single" w:sz="6" w:space="8" w:color="DDDDDD"/>
-          <w:left w:val="single" w:sz="6" w:space="8" w:color="DDDDDD"/>
-          <w:bottom w:val="single" w:sz="6" w:space="8" w:color="DDDDDD"/>
-          <w:right w:val="single" w:sz="6" w:space="8" w:color="DDDDDD"/>
-        </w:pBdr>
-        <w:shd w:val="clear" w:color="auto" w:fill="F5F5F5"/>
-        <w:spacing w:before="80"/>
-        <w:rPr>
-          <w:color w:val="000000"/>
-          <w:sz w:val="18"/>
-          <w:szCs w:val="18"/>
-        </w:rPr>
-      </w:pPr>
-      <w:r>
-        <w:rPr>
-          <w:color w:val="000000"/>
-          <w:sz w:val="18"/>
-          <w:szCs w:val="18"/>
-        </w:rPr>
-        <w:t xml:space="preserve">    "FREE", "READY", "RUN", "SLEEP", "ZOMBIE"</w:t>
-      </w:r>
-    </w:p>
-    <w:p>
-      <w:pPr>
-        <w:pStyle w:val="HTMLPreformatted"/>
-        <w:pBdr>
-          <w:top w:val="single" w:sz="6" w:space="8" w:color="DDDDDD"/>
-          <w:left w:val="single" w:sz="6" w:space="8" w:color="DDDDDD"/>
-          <w:bottom w:val="single" w:sz="6" w:space="8" w:color="DDDDDD"/>
-          <w:right w:val="single" w:sz="6" w:space="8" w:color="DDDDDD"/>
-        </w:pBdr>
-        <w:shd w:val="clear" w:color="auto" w:fill="F5F5F5"/>
-        <w:spacing w:before="80"/>
-        <w:rPr>
-          <w:color w:val="000000"/>
-          <w:sz w:val="18"/>
-          <w:szCs w:val="18"/>
-        </w:rPr>
-      </w:pPr>
-      <w:r>
-        <w:rPr>
-          <w:color w:val="000000"/>
-          <w:sz w:val="18"/>
-          <w:szCs w:val="18"/>
-        </w:rPr>
-        <w:t>};</w:t>
+        <w:t xml:space="preserve"> (user/ps.c) lists active processes using the ps() system call, which fills an array of proc_info structures. Each entry contains the process’s PID, state, parent PID, and program name. The ps utility translates numeric states to human-readable names and displays a formatted table:</w:t>
+      </w:r>
+    </w:p>
+    <w:p>
+      <w:pPr>
+        <w:pStyle w:val="HTMLPreformatted"/>
+        <w:pBdr>
+          <w:top w:val="single" w:sz="6" w:space="8" w:color="DDDDDD"/>
+          <w:left w:val="single" w:sz="6" w:space="8" w:color="DDDDDD"/>
+          <w:bottom w:val="single" w:sz="6" w:space="8" w:color="DDDDDD"/>
+          <w:right w:val="single" w:sz="6" w:space="8" w:color="DDDDDD"/>
+        </w:pBdr>
+        <w:shd w:val="clear" w:color="auto" w:fill="F5F5F5"/>
+        <w:spacing w:before="80"/>
+        <w:rPr>
+          <w:color w:val="000000"/>
+          <w:sz w:val="18"/>
+          <w:szCs w:val="18"/>
+        </w:rPr>
+      </w:pPr>
+      <w:r>
+        <w:rPr>
+          <w:color w:val="000000"/>
+          <w:sz w:val="18"/>
+          <w:szCs w:val="18"/>
+        </w:rPr>
+        <w:t>printf("PID  STATE    PARENT  NAME\n");</w:t>
+      </w:r>
+    </w:p>
+    <w:p>
+      <w:pPr>
+        <w:pStyle w:val="HTMLPreformatted"/>
+        <w:pBdr>
+          <w:top w:val="single" w:sz="6" w:space="8" w:color="DDDDDD"/>
+          <w:left w:val="single" w:sz="6" w:space="8" w:color="DDDDDD"/>
+          <w:bottom w:val="single" w:sz="6" w:space="8" w:color="DDDDDD"/>
+          <w:right w:val="single" w:sz="6" w:space="8" w:color="DDDDDD"/>
+        </w:pBdr>
+        <w:shd w:val="clear" w:color="auto" w:fill="F5F5F5"/>
+        <w:spacing w:before="80"/>
+        <w:rPr>
+          <w:color w:val="000000"/>
+          <w:sz w:val="18"/>
+          <w:szCs w:val="18"/>
+        </w:rPr>
+      </w:pPr>
+      <w:r>
+        <w:rPr>
+          <w:color w:val="000000"/>
+          <w:sz w:val="18"/>
+          <w:szCs w:val="18"/>
+        </w:rPr>
+        <w:t>/* state is determined by if/else chain: "FREE", "RUN", "READY", etc. */</w:t>
+      </w:r>
+    </w:p>
+    <w:p>
+      <w:pPr>
+        <w:pStyle w:val="HTMLPreformatted"/>
+        <w:pBdr>
+          <w:top w:val="single" w:sz="6" w:space="8" w:color="DDDDDD"/>
+          <w:left w:val="single" w:sz="6" w:space="8" w:color="DDDDDD"/>
+          <w:bottom w:val="single" w:sz="6" w:space="8" w:color="DDDDDD"/>
+          <w:right w:val="single" w:sz="6" w:space="8" w:color="DDDDDD"/>
+        </w:pBdr>
+        <w:shd w:val="clear" w:color="auto" w:fill="F5F5F5"/>
+        <w:spacing w:before="80"/>
+        <w:rPr>
+          <w:color w:val="000000"/>
+          <w:sz w:val="18"/>
+          <w:szCs w:val="18"/>
+        </w:rPr>
+      </w:pPr>
+      <w:r>
+        <w:rPr>
+          <w:color w:val="000000"/>
+          <w:sz w:val="18"/>
+          <w:szCs w:val="18"/>
+        </w:rPr>
+        <w:t>printf("%-4d %-8s %-7d %s\n", pid, state, parent, name);</w:t>
       </w:r>
     </w:p>
     <w:p>
@@ -19292,7 +19363,7 @@
         <w:t>kill</w:t>
       </w:r>
       <w:r>
-        <w:t xml:space="preserve"> (user/kill.c) terminates a process by PID using the kill() system call. The kernel sets the target process to PROC_ZOMBIE and wakes its parent if it is waiting. A process cannot kill itself or the shell (parent == -1).</w:t>
+        <w:t xml:space="preserve"> (user/kill.c) terminates a process by PID using the kill() system call. The kernel sets the target process to PROC_ZOMBIE and wakes its parent if it is waiting.</w:t>
       </w:r>
     </w:p>
     <w:p>
@@ -19319,7 +19390,7 @@
         <w:spacing w:before="80" w:after="80"/>
       </w:pPr>
       <w:r>
-        <w:t>cat (user/cat.c) is a critical component of shell pipelines. It reads from stdin (or named files) and writes to stdout. Its simplicity is the point: cat does not know whether it is reading from a file, a pipe, or the console. The file descriptor abstraction makes all three look identical.</w:t>
+        <w:t>cat (user/cat.c) is a critical component of shell pipelines. It reads from stdin (or named files) and writes to stdout. Its simplicity is the point: cat does not know whether it is reading from a file, a pipe, or the console. The file descriptor abstraction makes all three look identical. When reading from the console (stdin), typing Ctrl-D signals end-of-file and causes cat to exit.</w:t>
       </w:r>
     </w:p>
     <w:p>
@@ -19354,7 +19425,7 @@
         <w:spacing w:before="80" w:after="80"/>
       </w:pPr>
       <w:r>
-        <w:t>ed (user/ed.c) is a minimal line editor inspired by the original Unix ed. It operates on a buffer of lines loaded from a file and supports these commands:</w:t>
+        <w:t>ed (user/ed.c) is a minimal line editor inspired by the original Unix ed. It operates on an in-memory buffer of up to 48 lines and supports these commands:</w:t>
       </w:r>
     </w:p>
     <w:p>
@@ -19369,57 +19440,87 @@
         <w:t>p</w:t>
       </w:r>
       <w:r>
-        <w:t xml:space="preserve"> (print) displays numbered lines. </w:t>
+        <w:t xml:space="preserve"> — without a line number, prints all lines with line numbers; </w:t>
       </w:r>
       <w:r>
         <w:rPr>
           <w:b/>
           <w:bCs/>
         </w:rPr>
-        <w:t>i</w:t>
-      </w:r>
-      <w:r>
-        <w:t xml:space="preserve"> (insert) adds lines before a position. </w:t>
+        <w:t>&lt;n&gt;p</w:t>
+      </w:r>
+      <w:r>
+        <w:t xml:space="preserve"> prints just line n. </w:t>
       </w:r>
       <w:r>
         <w:rPr>
           <w:b/>
           <w:bCs/>
         </w:rPr>
-        <w:t>a</w:t>
-      </w:r>
-      <w:r>
-        <w:t xml:space="preserve"> (append) adds lines after the last line or after a specified position. </w:t>
+        <w:t>o &lt;file&gt;</w:t>
+      </w:r>
+      <w:r>
+        <w:t xml:space="preserve"> opens a file and reads its contents into the buffer. </w:t>
       </w:r>
       <w:r>
         <w:rPr>
           <w:b/>
           <w:bCs/>
         </w:rPr>
-        <w:t>d</w:t>
-      </w:r>
-      <w:r>
-        <w:t xml:space="preserve"> (delete) removes a line. </w:t>
+        <w:t>&lt;n&gt;i</w:t>
+      </w:r>
+      <w:r>
+        <w:t xml:space="preserve"> inserts new lines before line n; the line number is required. The editor prompts for lines of text until the user types a line containing just “.” (a single dot), which ends the insert. </w:t>
       </w:r>
       <w:r>
         <w:rPr>
           <w:b/>
           <w:bCs/>
         </w:rPr>
-        <w:t>w</w:t>
-      </w:r>
-      <w:r>
-        <w:t xml:space="preserve"> (write) saves the buffer back to the file. </w:t>
+        <w:t>&lt;n&gt;a</w:t>
+      </w:r>
+      <w:r>
+        <w:t xml:space="preserve"> appends new lines after line n; the line number is also required, and input is terminated by a “.” line. </w:t>
       </w:r>
       <w:r>
         <w:rPr>
           <w:b/>
           <w:bCs/>
         </w:rPr>
+        <w:t>&lt;n&gt;d</w:t>
+      </w:r>
+      <w:r>
+        <w:t xml:space="preserve"> deletes line n. </w:t>
+      </w:r>
+      <w:r>
+        <w:rPr>
+          <w:b/>
+          <w:bCs/>
+        </w:rPr>
+        <w:t>w &lt;file&gt;</w:t>
+      </w:r>
+      <w:r>
+        <w:t xml:space="preserve"> writes the buffer to a file. </w:t>
+      </w:r>
+      <w:r>
+        <w:rPr>
+          <w:b/>
+          <w:bCs/>
+        </w:rPr>
         <w:t>q</w:t>
       </w:r>
       <w:r>
-        <w:t xml:space="preserve"> (quit) exits.</w:t>
+        <w:t xml:space="preserve"> quits the editor. </w:t>
+      </w:r>
+      <w:r>
+        <w:rPr>
+          <w:b/>
+          <w:bCs/>
+        </w:rPr>
+        <w:t>h</w:t>
+      </w:r>
+      <w:r>
+        <w:t xml:space="preserve"> displays a summary of available commands.</w:t>
       </w:r>
     </w:p>
     <w:p>
@@ -19427,7 +19528,7 @@
         <w:spacing w:before="80" w:after="80"/>
       </w:pPr>
       <w:r>
-        <w:t>ed demonstrates file I/O in a more complex pattern than simple read-and-print utilities. It must maintain an in-memory buffer, parse user commands, and manage file state. Despite this complexity, it fits in a few hundred lines and uses only basic system calls.</w:t>
+        <w:t>ed demonstrates file I/O in a more complex pattern than simple read-and-print utilities. It must maintain an in-memory buffer, parse user commands, and manage file state. ed reads input using the console driver’s line-buffered mode with echo and backspace support. Despite this complexity, it fits in a few hundred lines and uses only basic system calls.</w:t>
       </w:r>
     </w:p>
     <w:p>
@@ -29444,6 +29545,7 @@
         <w:rPr>
           <w:color w:val="1B6B93"/>
         </w:rPr>
+        <w:lastRenderedPageBreak/>
         <w:t xml:space="preserve">•  </w:t>
       </w:r>
       <w:r>
@@ -29506,7 +29608,6 @@
         <w:spacing w:before="80" w:after="80"/>
       </w:pPr>
       <w:r>
-        <w:lastRenderedPageBreak/>
         <w:t>The log</w:t>
       </w:r>
       <w:r>
@@ -29987,7 +30088,6 @@
       </w:pBdr>
       <w:jc w:val="right"/>
     </w:pPr>
-    <w:proofErr w:type="spellStart"/>
     <w:r>
       <w:rPr>
         <w:color w:val="555566"/>
@@ -30006,7 +30106,6 @@
       </w:rPr>
       <w:t>OS</w:t>
     </w:r>
-    <w:proofErr w:type="spellEnd"/>
     <w:r>
       <w:rPr>
         <w:color w:val="555566"/>

</xml_diff>

<commit_message>
Update docs for 64 inodes, 1024 blocks, accurate state order
- CLAUDE.md: 64 inodes, 1024-block filesystem layout, fix process
  state order (READY=1, RUNNING=2), ls shows type/size, ps shows
  parent PID and program name, ed command syntax, cat Ctrl-D
- README.md: 64 inodes, 1024 blocks, fix process state order
- Textbook: update filesystem chapter (64 inodes, 1024 blocks,
  16-block inode table), fix Ch2 spawn→fork description

Co-Authored-By: Claude Opus 4.6 (1M context) <noreply@anthropic.com>
</commit_message>
<xml_diff>
--- a/textbook/logos-textbook.docx
+++ b/textbook/logos-textbook.docx
@@ -10007,7 +10007,7 @@
         <w:spacing w:before="80" w:after="80"/>
       </w:pPr>
       <w:r>
-        <w:t>There are 8 process slots (numbered 0 through 7). Slot 0 is always used for the shell. When the shell spawns a command, the command is loaded into slot 1. If that command spawns another program, it goes into slot 2, and so on.</w:t>
+        <w:t>There are 8 process slots (numbered 0 through 7). Slot 0 is always used for the shell. When the shell forks a child to run a command, the child is loaded into the next available slot. Multiple processes can run concurrently via preemptive multitasking.</w:t>
       </w:r>
     </w:p>
     <w:p>
@@ -19955,7 +19955,7 @@
         <w:spacing w:before="80" w:after="80"/>
       </w:pPr>
       <w:r>
-        <w:t>The filesystem occupies 512 blocks of 512 bytes each (256KB total). The blocks are organized as follows:</w:t>
+        <w:t>The filesystem occupies 1024 blocks of 512 bytes each (512KB total). The blocks are organized as follows:</w:t>
       </w:r>
     </w:p>
     <w:p>
@@ -19994,7 +19994,7 @@
         <w:spacing w:before="80" w:after="80"/>
       </w:pPr>
       <w:r>
-        <w:t>Blocks 2-9 Inode table (32 inodes x 128 bytes = 4 per block)</w:t>
+        <w:t>Blocks 3-18 Inode table (64 inodes x 128 bytes = 4 per block)</w:t>
       </w:r>
     </w:p>
     <w:p>
@@ -21522,7 +21522,7 @@
         <w:spacing w:before="80" w:after="80"/>
       </w:pPr>
       <w:r>
-        <w:t>The inode table holds 32 inodes. With 4 inodes per block (128 bytes each in a 512-byte block), the table occupies 8 blocks. Inode 0 is always the root directory.</w:t>
+        <w:t>The inode table holds 64 inodes. With 4 inodes per block (128 bytes each in a 512-byte block), the table occupies 16 blocks. Inode 0 is always the root directory.</w:t>
       </w:r>
     </w:p>
     <w:p>

</xml_diff>

<commit_message>
Fix textbook Ch8 filesystem values after review
Full chapter-by-chapter review found stale values in Ch8:
- Bitmap: "Block 1" -> "Blocks 1-2"
- Data blocks: "Blocks 10-511" -> "Blocks 19-1023"
- Superblock struct comments: 512->1024 blocks, 32->64 inodes,
  bitmap_blocks 1->2, inode_start 2->3, inode_blocks 8->16,
  data_start 6->19
- "256KB filesystem" -> "512KB filesystem"
- "single-process execution model" -> "single-core execution model"

Co-Authored-By: Claude Opus 4.6 (1M context) <noreply@anthropic.com>
</commit_message>
<xml_diff>
--- a/textbook/logos-textbook.docx
+++ b/textbook/logos-textbook.docx
@@ -19981,7 +19981,7 @@
         <w:spacing w:before="80" w:after="80"/>
       </w:pPr>
       <w:r>
-        <w:t>Block 1 Block allocation bitmap</w:t>
+        <w:t>Blocks 1-2 Block allocation bitmap</w:t>
       </w:r>
     </w:p>
     <w:p>
@@ -20007,7 +20007,7 @@
         <w:spacing w:before="80" w:after="80"/>
       </w:pPr>
       <w:r>
-        <w:t>Blocks 10-511 Data blocks (for file/directory contents)</w:t>
+        <w:t>Blocks 19-1023 Data blocks (for file/directory contents)</w:t>
       </w:r>
     </w:p>
     <w:p>
@@ -20196,7 +20196,7 @@
                 <w:sz w:val="18"/>
                 <w:szCs w:val="18"/>
               </w:rPr>
-              <w:t xml:space="preserve">    uint32_t total_blocks; /* 512 */</w:t>
+              <w:t xml:space="preserve">    uint32_t total_blocks; /* 1024 */</w:t>
             </w:r>
             <w:r>
               <w:br/>
@@ -20208,7 +20208,7 @@
                 <w:sz w:val="18"/>
                 <w:szCs w:val="18"/>
               </w:rPr>
-              <w:t xml:space="preserve">    uint32_t total_inodes; /* 32 */</w:t>
+              <w:t xml:space="preserve">    uint32_t total_inodes; /* 64 */</w:t>
             </w:r>
             <w:r>
               <w:br/>
@@ -20256,7 +20256,7 @@
                 <w:sz w:val="18"/>
                 <w:szCs w:val="18"/>
               </w:rPr>
-              <w:t xml:space="preserve">    uint32_t bitmap_blocks; /* Number of bitmap blocks (1) */ </w:t>
+              <w:t xml:space="preserve">    uint32_t bitmap_blocks; /* Number of bitmap blocks (2) */ </w:t>
             </w:r>
             <w:r>
               <w:br/>
@@ -20268,7 +20268,7 @@
                 <w:sz w:val="18"/>
                 <w:szCs w:val="18"/>
               </w:rPr>
-              <w:t xml:space="preserve">    uint32_t inode_start; /* First block of inode table (2) */</w:t>
+              <w:t xml:space="preserve">    uint32_t inode_start; /* First block of inode table (3) */</w:t>
             </w:r>
             <w:r>
               <w:br/>
@@ -20280,7 +20280,7 @@
                 <w:sz w:val="18"/>
                 <w:szCs w:val="18"/>
               </w:rPr>
-              <w:t xml:space="preserve">    uint32_t inode_blocks; /* Blocks in inode table (8) */</w:t>
+              <w:t xml:space="preserve">    uint32_t inode_blocks; /* Blocks in inode table (16) */</w:t>
             </w:r>
             <w:r>
               <w:br/>
@@ -20292,7 +20292,7 @@
                 <w:sz w:val="18"/>
                 <w:szCs w:val="18"/>
               </w:rPr>
-              <w:t xml:space="preserve">    uint32_t data_start; /* First data block (6) */</w:t>
+              <w:t xml:space="preserve">    uint32_t data_start; /* First data block (19) */</w:t>
             </w:r>
             <w:r>
               <w:br/>
@@ -21486,7 +21486,7 @@
         <w:t>OS</w:t>
       </w:r>
       <w:r>
-        <w:t>'s 256KB filesystem, this is more than sufficient.</w:t>
+        <w:t>'s 512KB filesystem, this is more than sufficient.</w:t>
       </w:r>
     </w:p>
     <w:p>
@@ -23469,7 +23469,7 @@
         <w:t>OS</w:t>
       </w:r>
       <w:r>
-        <w:t>'s single-process execution model avoids this complexity.</w:t>
+        <w:t>'s single-core execution model (with interrupts disabled during kernel code) avoids this complexity.</w:t>
       </w:r>
     </w:p>
     <w:p>

</xml_diff>